<commit_message>
reorganize the test folder
</commit_message>
<xml_diff>
--- a/docs/Technical Documentation.docx
+++ b/docs/Technical Documentation.docx
@@ -9985,21 +9985,7 @@
           <w:szCs w:val="48"/>
         </w:rPr>
         <w:lastRenderedPageBreak/>
-        <w:t>[</w:t>
-      </w:r>
-      <w:r>
-        <w:rPr>
-          <w:sz w:val="56"/>
-          <w:szCs w:val="48"/>
-        </w:rPr>
-        <w:t>Uploading the Program as Compiled Binary</w:t>
-      </w:r>
-      <w:r>
-        <w:rPr>
-          <w:sz w:val="56"/>
-          <w:szCs w:val="48"/>
-        </w:rPr>
-        <w:t>.]</w:t>
+        <w:t>[Uploading the Program as Compiled Binary.]</w:t>
       </w:r>
     </w:p>
     <w:p>
@@ -10118,13 +10104,7 @@
         <w:pStyle w:val="Nadpis2"/>
       </w:pPr>
       <w:r>
-        <w:t xml:space="preserve">The </w:t>
-      </w:r>
-      <w:r>
-        <w:t xml:space="preserve">Uploading </w:t>
-      </w:r>
-      <w:r>
-        <w:t>Process</w:t>
+        <w:t>The Uploading Process</w:t>
       </w:r>
     </w:p>
     <w:p>
@@ -10280,7 +10260,20 @@
           <w:b/>
           <w:bCs/>
         </w:rPr>
-        <w:t>~/Library/Arduino15/packages/esp32/tools/esptool_py/</w:t>
+        <w:t>~/Library/Arduino15/packages/esp32/tools/esptool_py/  &gt; Version-numbered folder &gt; esptool</w:t>
+      </w:r>
+      <w:r>
+        <w:rPr>
+          <w:rFonts w:cstheme="minorHAnsi"/>
+        </w:rPr>
+        <w:br/>
+        <w:t>In my case the full path looked like this:</w:t>
+      </w:r>
+      <w:r>
+        <w:rPr>
+          <w:rFonts w:cstheme="minorHAnsi"/>
+        </w:rPr>
+        <w:br/>
       </w:r>
       <w:r>
         <w:rPr>
@@ -10288,36 +10281,7 @@
           <w:b/>
           <w:bCs/>
         </w:rPr>
-        <w:t xml:space="preserve">  &gt; Version-numbered folder &gt; esptool</w:t>
-      </w:r>
-      <w:r>
-        <w:rPr>
-          <w:rFonts w:cstheme="minorHAnsi"/>
-        </w:rPr>
-        <w:br/>
-        <w:t>In my case the full path looked like this:</w:t>
-      </w:r>
-      <w:r>
-        <w:rPr>
-          <w:rFonts w:cstheme="minorHAnsi"/>
-        </w:rPr>
-        <w:br/>
-      </w:r>
-      <w:r>
-        <w:rPr>
-          <w:rFonts w:cstheme="minorHAnsi"/>
-          <w:b/>
-          <w:bCs/>
-        </w:rPr>
-        <w:t>MacintoshHD</w:t>
-      </w:r>
-      <w:r>
-        <w:rPr>
-          <w:rFonts w:cstheme="minorHAnsi"/>
-          <w:b/>
-          <w:bCs/>
-        </w:rPr>
-        <w:t>/Users/romanalexandrov/Library/Arduino15/packages/esp32/tools/esptool_py/4.6/esptool</w:t>
+        <w:t>MacintoshHD/Users/romanalexandrov/Library/Arduino15/packages/esp32/tools/esptool_py/4.6/esptool</w:t>
       </w:r>
       <w:r>
         <w:rPr>
@@ -10464,51 +10428,7 @@
             <w:szCs w:val="22"/>
             <w:u w:val="single"/>
           </w:rPr>
-          <w:t>https://randomnerdtutorials</w:t>
-        </w:r>
-        <w:r>
-          <w:rPr>
-            <w:rFonts w:asciiTheme="minorHAnsi" w:hAnsiTheme="minorHAnsi" w:cstheme="minorHAnsi"/>
-            <w:b/>
-            <w:bCs/>
-            <w:sz w:val="22"/>
-            <w:szCs w:val="22"/>
-            <w:u w:val="single"/>
-          </w:rPr>
-          <w:t>.</w:t>
-        </w:r>
-        <w:r>
-          <w:rPr>
-            <w:rFonts w:asciiTheme="minorHAnsi" w:hAnsiTheme="minorHAnsi" w:cstheme="minorHAnsi"/>
-            <w:b/>
-            <w:bCs/>
-            <w:sz w:val="22"/>
-            <w:szCs w:val="22"/>
-            <w:u w:val="single"/>
-          </w:rPr>
-          <w:t>com/getting-</w:t>
-        </w:r>
-        <w:r>
-          <w:rPr>
-            <w:rFonts w:asciiTheme="minorHAnsi" w:hAnsiTheme="minorHAnsi" w:cstheme="minorHAnsi"/>
-            <w:b/>
-            <w:bCs/>
-            <w:sz w:val="22"/>
-            <w:szCs w:val="22"/>
-            <w:u w:val="single"/>
-          </w:rPr>
-          <w:t>s</w:t>
-        </w:r>
-        <w:r>
-          <w:rPr>
-            <w:rFonts w:asciiTheme="minorHAnsi" w:hAnsiTheme="minorHAnsi" w:cstheme="minorHAnsi"/>
-            <w:b/>
-            <w:bCs/>
-            <w:sz w:val="22"/>
-            <w:szCs w:val="22"/>
-            <w:u w:val="single"/>
-          </w:rPr>
-          <w:t>tarted-with-esp32/#esp32-arduino-ide</w:t>
+          <w:t>https://randomnerdtutorials.com/getting-started-with-esp32/#esp32-arduino-ide</w:t>
         </w:r>
       </w:hyperlink>
     </w:p>
@@ -10779,43 +10699,7 @@
         <w:rPr>
           <w:rFonts w:cstheme="minorHAnsi"/>
         </w:rPr>
-        <w:t xml:space="preserve"> to find wich port the Sign is connected to. In the results, look for somethig like </w:t>
-      </w:r>
-      <w:r>
-        <w:rPr>
-          <w:rFonts w:cstheme="minorHAnsi"/>
-        </w:rPr>
-        <w:t>/dev/cu.usbmodem</w:t>
-      </w:r>
-      <w:r>
-        <w:rPr>
-          <w:rFonts w:cstheme="minorHAnsi"/>
-        </w:rPr>
-        <w:t xml:space="preserve">XXXX or </w:t>
-      </w:r>
-      <w:r>
-        <w:rPr>
-          <w:rFonts w:cstheme="minorHAnsi"/>
-        </w:rPr>
-        <w:t>/dev/cu.usbserial-</w:t>
-      </w:r>
-      <w:r>
-        <w:rPr>
-          <w:rFonts w:cstheme="minorHAnsi"/>
-        </w:rPr>
-        <w:t xml:space="preserve">XXXX or </w:t>
-      </w:r>
-      <w:r>
-        <w:rPr>
-          <w:rFonts w:cstheme="minorHAnsi"/>
-        </w:rPr>
-        <w:t>/dev/cu.</w:t>
-      </w:r>
-      <w:r>
-        <w:rPr>
-          <w:rFonts w:cstheme="minorHAnsi"/>
-        </w:rPr>
-        <w:t>esp32c3</w:t>
+        <w:t xml:space="preserve"> to find wich port the Sign is connected to. In the results, look for somethig like /dev/cu.usbmodemXXXX or /dev/cu.usbserial-XXXX or /dev/cu.esp32c3</w:t>
       </w:r>
       <w:r>
         <w:rPr>
@@ -10948,11 +10832,6 @@
           <w:rFonts w:cstheme="minorHAnsi"/>
         </w:rPr>
         <w:br/>
-      </w:r>
-      <w:r>
-        <w:rPr>
-          <w:rFonts w:cstheme="minorHAnsi"/>
-        </w:rPr>
         <w:t xml:space="preserve">  --chip esp32c3 \</w:t>
       </w:r>
       <w:r>
@@ -10960,11 +10839,6 @@
           <w:rFonts w:cstheme="minorHAnsi"/>
         </w:rPr>
         <w:br/>
-      </w:r>
-      <w:r>
-        <w:rPr>
-          <w:rFonts w:cstheme="minorHAnsi"/>
-        </w:rPr>
         <w:t xml:space="preserve">  --port </w:t>
       </w:r>
       <w:r>
@@ -10984,11 +10858,6 @@
           <w:rFonts w:cstheme="minorHAnsi"/>
         </w:rPr>
         <w:br/>
-      </w:r>
-      <w:r>
-        <w:rPr>
-          <w:rFonts w:cstheme="minorHAnsi"/>
-        </w:rPr>
         <w:t xml:space="preserve">  --baud 115200 \</w:t>
       </w:r>
       <w:r>
@@ -10996,12 +10865,20 @@
           <w:rFonts w:cstheme="minorHAnsi"/>
         </w:rPr>
         <w:br/>
-      </w:r>
-      <w:r>
-        <w:rPr>
-          <w:rFonts w:cstheme="minorHAnsi"/>
-        </w:rPr>
-        <w:t xml:space="preserve">  write_flash 0x0000 </w:t>
+        <w:t xml:space="preserve">  write_flash 0x</w:t>
+      </w:r>
+      <w:r>
+        <w:rPr>
+          <w:rFonts w:cstheme="minorHAnsi"/>
+          <w:lang w:val="en-US"/>
+        </w:rPr>
+        <w:t>1</w:t>
+      </w:r>
+      <w:r>
+        <w:rPr>
+          <w:rFonts w:cstheme="minorHAnsi"/>
+        </w:rPr>
+        <w:t xml:space="preserve">0000 </w:t>
       </w:r>
       <w:r>
         <w:rPr>
@@ -11037,19 +10914,7 @@
         <w:rPr>
           <w:rFonts w:cstheme="minorHAnsi"/>
         </w:rPr>
-        <w:t xml:space="preserve"> you should change </w:t>
-      </w:r>
-      <w:r>
-        <w:rPr>
-          <w:rFonts w:cstheme="minorHAnsi"/>
-        </w:rPr>
-        <w:t>YOUR_PORT_NAME</w:t>
-      </w:r>
-      <w:r>
-        <w:rPr>
-          <w:rFonts w:cstheme="minorHAnsi"/>
-        </w:rPr>
-        <w:t xml:space="preserve"> to </w:t>
+        <w:t xml:space="preserve"> you should change YOUR_PORT_NAME to </w:t>
       </w:r>
       <w:r>
         <w:rPr>
@@ -11115,13 +10980,7 @@
         <w:rPr>
           <w:rFonts w:cstheme="minorHAnsi"/>
         </w:rPr>
-        <w:t xml:space="preserve"> to the name of the .bin file. </w:t>
-      </w:r>
-      <w:r>
-        <w:rPr>
-          <w:rFonts w:cstheme="minorHAnsi"/>
-        </w:rPr>
-        <w:t>For example:</w:t>
+        <w:t xml:space="preserve"> to the name of the .bin file. For example:</w:t>
       </w:r>
       <w:r>
         <w:rPr>
@@ -11133,7 +10992,19 @@
         <w:rPr>
           <w:rFonts w:cstheme="minorHAnsi"/>
         </w:rPr>
-        <w:t>write_flash 0x0000 42-Smart-Cluster-Sign.ino.XIAO_ESP32C3.bin</w:t>
+        <w:t>write_flash 0x</w:t>
+      </w:r>
+      <w:r>
+        <w:rPr>
+          <w:rFonts w:cstheme="minorHAnsi"/>
+        </w:rPr>
+        <w:t>1</w:t>
+      </w:r>
+      <w:r>
+        <w:rPr>
+          <w:rFonts w:cstheme="minorHAnsi"/>
+        </w:rPr>
+        <w:t>0000 42-Smart-Cluster-Sign.ino.XIAO_ESP32C3.bin</w:t>
       </w:r>
     </w:p>
     <w:p>
@@ -11243,19 +11114,7 @@
         <w:rPr>
           <w:rFonts w:cstheme="minorHAnsi"/>
         </w:rPr>
-        <w:t>on the back of the Sign</w:t>
-      </w:r>
-      <w:r>
-        <w:rPr>
-          <w:rFonts w:cstheme="minorHAnsi"/>
-        </w:rPr>
-        <w:t xml:space="preserve"> </w:t>
-      </w:r>
-      <w:r>
-        <w:rPr>
-          <w:rFonts w:cstheme="minorHAnsi"/>
-        </w:rPr>
-        <w:t>once</w:t>
+        <w:t>on the back of the Sign once</w:t>
       </w:r>
       <w:r>
         <w:rPr>
@@ -33731,39 +33590,39 @@
         <w:ind w:right="441"/>
         <w:rPr>
           <w:rFonts w:ascii="AppleSystemUIFont" w:hAnsi="AppleSystemUIFont" w:cs="AppleSystemUIFont"/>
-          <w:sz w:val="26"/>
-          <w:szCs w:val="26"/>
+          <w:sz w:val="24"/>
+          <w:szCs w:val="24"/>
         </w:rPr>
       </w:pPr>
       <w:r>
         <w:rPr>
           <w:rFonts w:ascii="AppleSystemUIFont" w:hAnsi="AppleSystemUIFont" w:cs="AppleSystemUIFont"/>
-          <w:sz w:val="26"/>
-          <w:szCs w:val="26"/>
+          <w:sz w:val="24"/>
+          <w:szCs w:val="24"/>
         </w:rPr>
         <w:t>make sure that the Sign and your computer are connected to the same Wi-Fi network</w:t>
       </w:r>
       <w:r>
         <w:rPr>
           <w:rFonts w:ascii="AppleSystemUIFont" w:hAnsi="AppleSystemUIFont" w:cs="AppleSystemUIFont"/>
-          <w:sz w:val="26"/>
-          <w:szCs w:val="26"/>
+          <w:sz w:val="24"/>
+          <w:szCs w:val="24"/>
         </w:rPr>
         <w:t xml:space="preserve"> and to the same Wi-Fi modem within that network</w:t>
       </w:r>
       <w:r>
         <w:rPr>
           <w:rFonts w:ascii="AppleSystemUIFont" w:hAnsi="AppleSystemUIFont" w:cs="AppleSystemUIFont"/>
-          <w:sz w:val="26"/>
-          <w:szCs w:val="26"/>
+          <w:sz w:val="24"/>
+          <w:szCs w:val="24"/>
         </w:rPr>
         <w:t>.</w:t>
       </w:r>
       <w:r>
         <w:rPr>
           <w:rFonts w:ascii="AppleSystemUIFont" w:hAnsi="AppleSystemUIFont" w:cs="AppleSystemUIFont"/>
-          <w:sz w:val="26"/>
-          <w:szCs w:val="26"/>
+          <w:sz w:val="24"/>
+          <w:szCs w:val="24"/>
         </w:rPr>
         <w:t xml:space="preserve"> In the Telegram chat prompt the Sign with the „/status“ command to see the MAC address of the Wi-Fi modem it is currently connected to. </w:t>
       </w:r>
@@ -33782,15 +33641,15 @@
         <w:ind w:right="441"/>
         <w:rPr>
           <w:rFonts w:ascii="AppleSystemUIFont" w:hAnsi="AppleSystemUIFont" w:cs="AppleSystemUIFont"/>
-          <w:sz w:val="26"/>
-          <w:szCs w:val="26"/>
+          <w:sz w:val="24"/>
+          <w:szCs w:val="24"/>
         </w:rPr>
       </w:pPr>
       <w:r>
         <w:rPr>
           <w:rFonts w:ascii="AppleSystemUIFont" w:hAnsi="AppleSystemUIFont" w:cs="AppleSystemUIFont"/>
-          <w:sz w:val="26"/>
-          <w:szCs w:val="26"/>
+          <w:sz w:val="24"/>
+          <w:szCs w:val="24"/>
         </w:rPr>
         <w:t>try closing and reopening Arduino IDE.</w:t>
       </w:r>
@@ -33809,55 +33668,34 @@
         <w:ind w:right="441"/>
         <w:rPr>
           <w:rFonts w:ascii="AppleSystemUIFont" w:hAnsi="AppleSystemUIFont" w:cs="AppleSystemUIFont"/>
-          <w:sz w:val="26"/>
-          <w:szCs w:val="26"/>
+          <w:sz w:val="24"/>
+          <w:szCs w:val="24"/>
         </w:rPr>
       </w:pPr>
       <w:r>
         <w:rPr>
           <w:rFonts w:ascii="AppleSystemUIFont" w:hAnsi="AppleSystemUIFont" w:cs="AppleSystemUIFont"/>
-          <w:sz w:val="26"/>
-          <w:szCs w:val="26"/>
-        </w:rPr>
-        <w:t>t</w:t>
+          <w:sz w:val="24"/>
+          <w:szCs w:val="24"/>
+        </w:rPr>
+        <w:t>the school firewall may be blocking OTA connection. Ask your campus system administrator if it could be overc</w:t>
       </w:r>
       <w:r>
         <w:rPr>
           <w:rFonts w:ascii="AppleSystemUIFont" w:hAnsi="AppleSystemUIFont" w:cs="AppleSystemUIFont"/>
-          <w:sz w:val="26"/>
-          <w:szCs w:val="26"/>
-        </w:rPr>
-        <w:t>he school firewall may be blocking OTA connection. Ask your campus system administrator if it could be overc</w:t>
+          <w:sz w:val="24"/>
+          <w:szCs w:val="24"/>
+        </w:rPr>
+        <w:t>o</w:t>
       </w:r>
       <w:r>
         <w:rPr>
           <w:rFonts w:ascii="AppleSystemUIFont" w:hAnsi="AppleSystemUIFont" w:cs="AppleSystemUIFont"/>
-          <w:sz w:val="26"/>
-          <w:szCs w:val="26"/>
-        </w:rPr>
-        <w:t>o</w:t>
-      </w:r>
-      <w:r>
-        <w:rPr>
-          <w:rFonts w:ascii="AppleSystemUIFont" w:hAnsi="AppleSystemUIFont" w:cs="AppleSystemUIFont"/>
-          <w:sz w:val="26"/>
-          <w:szCs w:val="26"/>
+          <w:sz w:val="24"/>
+          <w:szCs w:val="24"/>
         </w:rPr>
         <w:t>me.</w:t>
       </w:r>
-    </w:p>
-    <w:p>
-      <w:pPr>
-        <w:autoSpaceDE w:val="0"/>
-        <w:autoSpaceDN w:val="0"/>
-        <w:adjustRightInd w:val="0"/>
-        <w:ind w:right="441"/>
-        <w:rPr>
-          <w:rFonts w:ascii="AppleSystemUIFont" w:hAnsi="AppleSystemUIFont" w:cs="AppleSystemUIFont"/>
-          <w:sz w:val="26"/>
-          <w:szCs w:val="26"/>
-        </w:rPr>
-      </w:pPr>
     </w:p>
     <w:p>
       <w:pPr>
@@ -34479,7 +34317,7 @@
           <w:sz w:val="24"/>
           <w:szCs w:val="24"/>
         </w:rPr>
-        <w:t xml:space="preserve">often happens when something is wrong with the Secret token authentication, commonly with the Secret token itself. Most likely, an extra character was added to your Secret token </w:t>
+        <w:t xml:space="preserve">often happens when something is wrong with the Secret token authentication, commonly with the Secret token itself. Most likely, an extra character was added to your Secret token somewhere along the way. The character may even not to be visible in the Serial monitor. </w:t>
       </w:r>
       <w:r>
         <w:rPr>
@@ -34488,7 +34326,7 @@
           <w:szCs w:val="24"/>
         </w:rPr>
         <w:lastRenderedPageBreak/>
-        <w:t>somewhere along the way. The character may even not to be visible in the Serial monitor. It may happen when you write to or read from the filesystem files. Try using trim() on the variable (e.g. your_string_variable.trim();), it will remove spaces and/or new line signs at the beginning and at the end of the string.</w:t>
+        <w:t>It may happen when you write to or read from the filesystem files. Try using trim() on the variable (e.g. your_string_variable.trim();), it will remove spaces and/or new line signs at the beginning and at the end of the string.</w:t>
       </w:r>
     </w:p>
     <w:p>
@@ -43301,6 +43139,15 @@
 </file>
 
 <file path=customXml/item1.xml><?xml version="1.0" encoding="utf-8"?>
+<?mso-contentType ?>
+<FormTemplates xmlns="http://schemas.microsoft.com/sharepoint/v3/contenttype/forms">
+  <Display>DocumentLibraryForm</Display>
+  <Edit>AssetEditForm</Edit>
+  <New>DocumentLibraryForm</New>
+</FormTemplates>
+</file>
+
+<file path=customXml/item2.xml><?xml version="1.0" encoding="utf-8"?>
 <p:properties xmlns:p="http://schemas.microsoft.com/office/2006/metadata/properties" xmlns:xsi="http://www.w3.org/2001/XMLSchema-instance" xmlns:pc="http://schemas.microsoft.com/office/infopath/2007/PartnerControls">
   <documentManagement>
     <TPExecutable xmlns="4eb71313-1cf6-4961-b6ce-0c29fc5284b9" xsi:nil="true"/>
@@ -43427,16 +43274,11 @@
 </p:properties>
 </file>
 
-<file path=customXml/item2.xml><?xml version="1.0" encoding="utf-8"?>
-<?mso-contentType ?>
-<FormTemplates xmlns="http://schemas.microsoft.com/sharepoint/v3/contenttype/forms">
-  <Display>DocumentLibraryForm</Display>
-  <Edit>AssetEditForm</Edit>
-  <New>DocumentLibraryForm</New>
-</FormTemplates>
+<file path=customXml/item3.xml><?xml version="1.0" encoding="utf-8"?>
+<b:Sources xmlns:b="http://schemas.openxmlformats.org/officeDocument/2006/bibliography" xmlns="http://schemas.openxmlformats.org/officeDocument/2006/bibliography" SelectedStyle="/APASixthEditionOfficeOnline.xsl" StyleName="APA" Version="6"/>
 </file>
 
-<file path=customXml/item3.xml><?xml version="1.0" encoding="utf-8"?>
+<file path=customXml/item4.xml><?xml version="1.0" encoding="utf-8"?>
 <ct:contentTypeSchema xmlns:ct="http://schemas.microsoft.com/office/2006/metadata/contentType" xmlns:ma="http://schemas.microsoft.com/office/2006/metadata/properties/metaAttributes" ct:_="" ma:_="" ma:contentTypeName="TemplateFile" ma:contentTypeID="0x010100AC6DD24B17643A43B5911557F59D23340400899CD97D2199F748BA22A48D93649A64" ma:contentTypeVersion="58" ma:contentTypeDescription="Create a new document." ma:contentTypeScope="" ma:versionID="cb85242d804791fa63a999220e43a0bf">
   <xsd:schema xmlns:xsd="http://www.w3.org/2001/XMLSchema" xmlns:xs="http://www.w3.org/2001/XMLSchema" xmlns:p="http://schemas.microsoft.com/office/2006/metadata/properties" xmlns:ns2="4eb71313-1cf6-4961-b6ce-0c29fc5284b9" targetNamespace="http://schemas.microsoft.com/office/2006/metadata/properties" ma:root="true" ma:fieldsID="2e13631c6b34a2889e7ce7c8f1efd12b" ns2:_="">
     <xsd:import namespace="4eb71313-1cf6-4961-b6ce-0c29fc5284b9"/>
@@ -44470,11 +44312,15 @@
 </ct:contentTypeSchema>
 </file>
 
-<file path=customXml/item4.xml><?xml version="1.0" encoding="utf-8"?>
-<b:Sources xmlns:b="http://schemas.openxmlformats.org/officeDocument/2006/bibliography" xmlns="http://schemas.openxmlformats.org/officeDocument/2006/bibliography" SelectedStyle="/APASixthEditionOfficeOnline.xsl" StyleName="APA" Version="6"/>
+<file path=customXml/itemProps1.xml><?xml version="1.0" encoding="utf-8"?>
+<ds:datastoreItem xmlns:ds="http://schemas.openxmlformats.org/officeDocument/2006/customXml" ds:itemID="{42AF3EE1-17D6-4994-8D19-1C5A21673D61}">
+  <ds:schemaRefs>
+    <ds:schemaRef ds:uri="http://schemas.microsoft.com/sharepoint/v3/contenttype/forms"/>
+  </ds:schemaRefs>
+</ds:datastoreItem>
 </file>
 
-<file path=customXml/itemProps1.xml><?xml version="1.0" encoding="utf-8"?>
+<file path=customXml/itemProps2.xml><?xml version="1.0" encoding="utf-8"?>
 <ds:datastoreItem xmlns:ds="http://schemas.openxmlformats.org/officeDocument/2006/customXml" ds:itemID="{63E3A13E-B3BC-4A1C-88E3-0C4AF2AB6AEE}">
   <ds:schemaRefs>
     <ds:schemaRef ds:uri="http://schemas.microsoft.com/office/2006/metadata/properties"/>
@@ -44484,15 +44330,15 @@
 </ds:datastoreItem>
 </file>
 
-<file path=customXml/itemProps2.xml><?xml version="1.0" encoding="utf-8"?>
-<ds:datastoreItem xmlns:ds="http://schemas.openxmlformats.org/officeDocument/2006/customXml" ds:itemID="{42AF3EE1-17D6-4994-8D19-1C5A21673D61}">
+<file path=customXml/itemProps3.xml><?xml version="1.0" encoding="utf-8"?>
+<ds:datastoreItem xmlns:ds="http://schemas.openxmlformats.org/officeDocument/2006/customXml" ds:itemID="{A9C8C408-4E5E-524B-A672-45D328F6189D}">
   <ds:schemaRefs>
-    <ds:schemaRef ds:uri="http://schemas.microsoft.com/sharepoint/v3/contenttype/forms"/>
+    <ds:schemaRef ds:uri="http://schemas.openxmlformats.org/officeDocument/2006/bibliography"/>
   </ds:schemaRefs>
 </ds:datastoreItem>
 </file>
 
-<file path=customXml/itemProps3.xml><?xml version="1.0" encoding="utf-8"?>
+<file path=customXml/itemProps4.xml><?xml version="1.0" encoding="utf-8"?>
 <ds:datastoreItem xmlns:ds="http://schemas.openxmlformats.org/officeDocument/2006/customXml" ds:itemID="{3D5BC34A-A158-4DE6-9D48-EADCE6F2EC60}">
   <ds:schemaRefs>
     <ds:schemaRef ds:uri="http://schemas.microsoft.com/office/2006/metadata/contentType"/>
@@ -44508,12 +44354,4 @@
     <ds:schemaRef ds:uri="http://schemas.microsoft.com/internal/obd"/>
   </ds:schemaRefs>
 </ds:datastoreItem>
-</file>
-
-<file path=customXml/itemProps4.xml><?xml version="1.0" encoding="utf-8"?>
-<ds:datastoreItem xmlns:ds="http://schemas.openxmlformats.org/officeDocument/2006/customXml" ds:itemID="{A9C8C408-4E5E-524B-A672-45D328F6189D}">
-  <ds:schemaRefs>
-    <ds:schemaRef ds:uri="http://schemas.openxmlformats.org/officeDocument/2006/bibliography"/>
-  </ds:schemaRefs>
-</ds:datastoreItem>
 </file>
</xml_diff>

<commit_message>
add time source change to the documentation
</commit_message>
<xml_diff>
--- a/docs/Technical Documentation.docx
+++ b/docs/Technical Documentation.docx
@@ -23990,15 +23990,24 @@
           <w:sz w:val="22"/>
           <w:szCs w:val="22"/>
         </w:rPr>
-        <w:t xml:space="preserve"> has two </w:t>
-      </w:r>
-      <w:r>
-        <w:rPr>
-          <w:rFonts w:asciiTheme="minorHAnsi" w:hAnsiTheme="minorHAnsi" w:cstheme="minorHAnsi"/>
-          <w:sz w:val="22"/>
-          <w:szCs w:val="22"/>
-        </w:rPr>
-        <w:t xml:space="preserve">sources </w:t>
+        <w:t xml:space="preserve"> has </w:t>
+      </w:r>
+      <w:r>
+        <w:rPr>
+          <w:rFonts w:asciiTheme="minorHAnsi" w:hAnsiTheme="minorHAnsi" w:cstheme="minorHAnsi"/>
+          <w:sz w:val="22"/>
+          <w:szCs w:val="22"/>
+          <w:lang w:val="en-GB"/>
+        </w:rPr>
+        <w:t xml:space="preserve">one </w:t>
+      </w:r>
+      <w:r>
+        <w:rPr>
+          <w:rFonts w:asciiTheme="minorHAnsi" w:hAnsiTheme="minorHAnsi" w:cstheme="minorHAnsi"/>
+          <w:sz w:val="22"/>
+          <w:szCs w:val="22"/>
+        </w:rPr>
+        <w:t xml:space="preserve">source </w:t>
       </w:r>
       <w:r>
         <w:rPr>
@@ -24022,6 +24031,14 @@
           <w:sz w:val="22"/>
           <w:szCs w:val="22"/>
         </w:rPr>
+        <w:t xml:space="preserve"> – the Intra server</w:t>
+      </w:r>
+      <w:r>
+        <w:rPr>
+          <w:rFonts w:asciiTheme="minorHAnsi" w:hAnsiTheme="minorHAnsi" w:cstheme="minorHAnsi"/>
+          <w:sz w:val="22"/>
+          <w:szCs w:val="22"/>
+        </w:rPr>
         <w:t>.</w:t>
       </w:r>
       <w:r>
@@ -24030,49 +24047,145 @@
           <w:sz w:val="22"/>
           <w:szCs w:val="22"/>
         </w:rPr>
-        <w:t xml:space="preserve"> There is an NTP server for actual time and the Intra server for exam time.</w:t>
-      </w:r>
-    </w:p>
-    <w:p>
-      <w:pPr>
-        <w:rPr>
-          <w:rFonts w:asciiTheme="minorHAnsi" w:hAnsiTheme="minorHAnsi" w:cstheme="minorHAnsi"/>
-          <w:sz w:val="22"/>
-          <w:szCs w:val="22"/>
-        </w:rPr>
-      </w:pPr>
-    </w:p>
-    <w:p>
-      <w:pPr>
-        <w:rPr>
-          <w:rFonts w:asciiTheme="minorHAnsi" w:hAnsiTheme="minorHAnsi" w:cstheme="minorHAnsi"/>
-          <w:sz w:val="22"/>
-          <w:szCs w:val="22"/>
-        </w:rPr>
-      </w:pPr>
-      <w:r>
-        <w:rPr>
-          <w:rFonts w:asciiTheme="minorHAnsi" w:hAnsiTheme="minorHAnsi" w:cstheme="minorHAnsi"/>
-          <w:sz w:val="22"/>
-          <w:szCs w:val="22"/>
-        </w:rPr>
-        <w:t xml:space="preserve">Actual time data from the NTP server can be updated </w:t>
-      </w:r>
-      <w:r>
-        <w:rPr>
-          <w:rFonts w:asciiTheme="minorHAnsi" w:hAnsiTheme="minorHAnsi" w:cstheme="minorHAnsi"/>
-          <w:sz w:val="22"/>
-          <w:szCs w:val="22"/>
-        </w:rPr>
-        <w:t xml:space="preserve">at </w:t>
-      </w:r>
-      <w:r>
-        <w:rPr>
-          <w:rFonts w:asciiTheme="minorHAnsi" w:hAnsiTheme="minorHAnsi" w:cstheme="minorHAnsi"/>
-          <w:sz w:val="22"/>
-          <w:szCs w:val="22"/>
-        </w:rPr>
-        <w:t xml:space="preserve">any time by calling the get_time() function – it gets stored into 5 global variables: </w:t>
+        <w:t xml:space="preserve"> </w:t>
+      </w:r>
+      <w:r>
+        <w:rPr>
+          <w:rFonts w:asciiTheme="minorHAnsi" w:hAnsiTheme="minorHAnsi" w:cstheme="minorHAnsi"/>
+          <w:sz w:val="22"/>
+          <w:szCs w:val="22"/>
+        </w:rPr>
+        <w:t xml:space="preserve">It provides both the </w:t>
+      </w:r>
+      <w:r>
+        <w:rPr>
+          <w:rFonts w:asciiTheme="minorHAnsi" w:hAnsiTheme="minorHAnsi" w:cstheme="minorHAnsi"/>
+          <w:sz w:val="22"/>
+          <w:szCs w:val="22"/>
+        </w:rPr>
+        <w:t xml:space="preserve">actual time </w:t>
+      </w:r>
+      <w:r>
+        <w:rPr>
+          <w:rFonts w:asciiTheme="minorHAnsi" w:hAnsiTheme="minorHAnsi" w:cstheme="minorHAnsi"/>
+          <w:sz w:val="22"/>
+          <w:szCs w:val="22"/>
+        </w:rPr>
+        <w:t>for the system and the</w:t>
+      </w:r>
+      <w:r>
+        <w:rPr>
+          <w:rFonts w:asciiTheme="minorHAnsi" w:hAnsiTheme="minorHAnsi" w:cstheme="minorHAnsi"/>
+          <w:sz w:val="22"/>
+          <w:szCs w:val="22"/>
+        </w:rPr>
+        <w:t xml:space="preserve"> exam time.</w:t>
+      </w:r>
+    </w:p>
+    <w:p>
+      <w:pPr>
+        <w:rPr>
+          <w:rFonts w:asciiTheme="minorHAnsi" w:hAnsiTheme="minorHAnsi" w:cstheme="minorHAnsi"/>
+          <w:sz w:val="22"/>
+          <w:szCs w:val="22"/>
+        </w:rPr>
+      </w:pPr>
+    </w:p>
+    <w:p>
+      <w:pPr>
+        <w:rPr>
+          <w:rFonts w:asciiTheme="minorHAnsi" w:hAnsiTheme="minorHAnsi" w:cstheme="minorHAnsi"/>
+          <w:sz w:val="22"/>
+          <w:szCs w:val="22"/>
+        </w:rPr>
+      </w:pPr>
+      <w:r>
+        <w:rPr>
+          <w:rFonts w:asciiTheme="minorHAnsi" w:hAnsiTheme="minorHAnsi" w:cstheme="minorHAnsi"/>
+          <w:sz w:val="22"/>
+          <w:szCs w:val="22"/>
+        </w:rPr>
+        <w:t xml:space="preserve">Actual time data </w:t>
+      </w:r>
+      <w:r>
+        <w:rPr>
+          <w:rFonts w:asciiTheme="minorHAnsi" w:hAnsiTheme="minorHAnsi" w:cstheme="minorHAnsi"/>
+          <w:sz w:val="22"/>
+          <w:szCs w:val="22"/>
+        </w:rPr>
+        <w:t xml:space="preserve">gets </w:t>
+      </w:r>
+      <w:r>
+        <w:rPr>
+          <w:rFonts w:asciiTheme="minorHAnsi" w:hAnsiTheme="minorHAnsi" w:cstheme="minorHAnsi"/>
+          <w:sz w:val="22"/>
+          <w:szCs w:val="22"/>
+        </w:rPr>
+        <w:t xml:space="preserve">updated </w:t>
+      </w:r>
+      <w:r>
+        <w:rPr>
+          <w:rFonts w:asciiTheme="minorHAnsi" w:hAnsiTheme="minorHAnsi" w:cstheme="minorHAnsi"/>
+          <w:sz w:val="22"/>
+          <w:szCs w:val="22"/>
+        </w:rPr>
+        <w:t>every</w:t>
+      </w:r>
+      <w:r>
+        <w:rPr>
+          <w:rFonts w:asciiTheme="minorHAnsi" w:hAnsiTheme="minorHAnsi" w:cstheme="minorHAnsi"/>
+          <w:sz w:val="22"/>
+          <w:szCs w:val="22"/>
+        </w:rPr>
+        <w:t xml:space="preserve"> time </w:t>
+      </w:r>
+      <w:r>
+        <w:rPr>
+          <w:rFonts w:asciiTheme="minorHAnsi" w:hAnsiTheme="minorHAnsi" w:cstheme="minorHAnsi"/>
+          <w:sz w:val="22"/>
+          <w:szCs w:val="22"/>
+        </w:rPr>
+        <w:t xml:space="preserve">the device checks the exam </w:t>
+      </w:r>
+      <w:r>
+        <w:rPr>
+          <w:rFonts w:asciiTheme="minorHAnsi" w:hAnsiTheme="minorHAnsi" w:cstheme="minorHAnsi"/>
+          <w:sz w:val="22"/>
+          <w:szCs w:val="22"/>
+        </w:rPr>
+        <w:t xml:space="preserve">by calling the </w:t>
+      </w:r>
+      <w:r>
+        <w:rPr>
+          <w:rFonts w:asciiTheme="minorHAnsi" w:hAnsiTheme="minorHAnsi" w:cstheme="minorHAnsi"/>
+          <w:sz w:val="22"/>
+          <w:szCs w:val="22"/>
+        </w:rPr>
+        <w:t>fetch_exams</w:t>
+      </w:r>
+      <w:r>
+        <w:rPr>
+          <w:rFonts w:asciiTheme="minorHAnsi" w:hAnsiTheme="minorHAnsi" w:cstheme="minorHAnsi"/>
+          <w:sz w:val="22"/>
+          <w:szCs w:val="22"/>
+        </w:rPr>
+        <w:t>() function</w:t>
+      </w:r>
+      <w:r>
+        <w:rPr>
+          <w:rFonts w:asciiTheme="minorHAnsi" w:hAnsiTheme="minorHAnsi" w:cstheme="minorHAnsi"/>
+          <w:sz w:val="22"/>
+          <w:szCs w:val="22"/>
+        </w:rPr>
+        <w:t>. The actual time data</w:t>
+      </w:r>
+      <w:r>
+        <w:rPr>
+          <w:rFonts w:asciiTheme="minorHAnsi" w:hAnsiTheme="minorHAnsi" w:cstheme="minorHAnsi"/>
+          <w:sz w:val="22"/>
+          <w:szCs w:val="22"/>
+        </w:rPr>
+        <w:t xml:space="preserve"> gets stored in 5 global variables: </w:t>
       </w:r>
       <w:r>
         <w:rPr>
@@ -24152,7 +24265,39 @@
           <w:sz w:val="22"/>
           <w:szCs w:val="22"/>
         </w:rPr>
-        <w:t>. The time data in those global variables is already adjusted to the time zone</w:t>
+        <w:t xml:space="preserve">. The </w:t>
+      </w:r>
+      <w:r>
+        <w:rPr>
+          <w:rFonts w:asciiTheme="minorHAnsi" w:hAnsiTheme="minorHAnsi" w:cstheme="minorHAnsi"/>
+          <w:sz w:val="22"/>
+          <w:szCs w:val="22"/>
+        </w:rPr>
+        <w:t>values</w:t>
+      </w:r>
+      <w:r>
+        <w:rPr>
+          <w:rFonts w:asciiTheme="minorHAnsi" w:hAnsiTheme="minorHAnsi" w:cstheme="minorHAnsi"/>
+          <w:sz w:val="22"/>
+          <w:szCs w:val="22"/>
+        </w:rPr>
+        <w:t xml:space="preserve"> in those global variables </w:t>
+      </w:r>
+      <w:r>
+        <w:rPr>
+          <w:rFonts w:asciiTheme="minorHAnsi" w:hAnsiTheme="minorHAnsi" w:cstheme="minorHAnsi"/>
+          <w:sz w:val="22"/>
+          <w:szCs w:val="22"/>
+        </w:rPr>
+        <w:t>are</w:t>
+      </w:r>
+      <w:r>
+        <w:rPr>
+          <w:rFonts w:asciiTheme="minorHAnsi" w:hAnsiTheme="minorHAnsi" w:cstheme="minorHAnsi"/>
+          <w:sz w:val="22"/>
+          <w:szCs w:val="22"/>
+        </w:rPr>
+        <w:t xml:space="preserve"> already adjusted to the time zone</w:t>
       </w:r>
       <w:r>
         <w:rPr>
@@ -24194,7 +24339,7 @@
           <w:sz w:val="22"/>
           <w:szCs w:val="22"/>
         </w:rPr>
-        <w:t xml:space="preserve">Exam time data from the Intra server gets updated only when the </w:t>
+        <w:t xml:space="preserve">Exam time from the Intra server gets updated when the </w:t>
       </w:r>
       <w:r>
         <w:rPr>
@@ -24218,7 +24363,7 @@
           <w:sz w:val="22"/>
           <w:szCs w:val="22"/>
         </w:rPr>
-        <w:t xml:space="preserve">The exam time data is then stored in the following 4 global variables: </w:t>
+        <w:t xml:space="preserve">The exam time is then stored in the following 4 global variables: </w:t>
       </w:r>
       <w:r>
         <w:rPr>
@@ -24282,7 +24427,55 @@
           <w:sz w:val="22"/>
           <w:szCs w:val="22"/>
         </w:rPr>
-        <w:t>. There is no exam date variable, because the time data is searched only for the current day. The exam time data in those global variables is already adjusted to the time zone</w:t>
+        <w:t xml:space="preserve">. There is no exam date variable, because the </w:t>
+      </w:r>
+      <w:r>
+        <w:rPr>
+          <w:rFonts w:asciiTheme="minorHAnsi" w:hAnsiTheme="minorHAnsi" w:cstheme="minorHAnsi"/>
+          <w:sz w:val="22"/>
+          <w:szCs w:val="22"/>
+        </w:rPr>
+        <w:t xml:space="preserve">exam </w:t>
+      </w:r>
+      <w:r>
+        <w:rPr>
+          <w:rFonts w:asciiTheme="minorHAnsi" w:hAnsiTheme="minorHAnsi" w:cstheme="minorHAnsi"/>
+          <w:sz w:val="22"/>
+          <w:szCs w:val="22"/>
+        </w:rPr>
+        <w:t xml:space="preserve">time is searched only for the current day. The </w:t>
+      </w:r>
+      <w:r>
+        <w:rPr>
+          <w:rFonts w:asciiTheme="minorHAnsi" w:hAnsiTheme="minorHAnsi" w:cstheme="minorHAnsi"/>
+          <w:sz w:val="22"/>
+          <w:szCs w:val="22"/>
+        </w:rPr>
+        <w:t>values</w:t>
+      </w:r>
+      <w:r>
+        <w:rPr>
+          <w:rFonts w:asciiTheme="minorHAnsi" w:hAnsiTheme="minorHAnsi" w:cstheme="minorHAnsi"/>
+          <w:sz w:val="22"/>
+          <w:szCs w:val="22"/>
+        </w:rPr>
+        <w:t xml:space="preserve"> in those global variables </w:t>
+      </w:r>
+      <w:r>
+        <w:rPr>
+          <w:rFonts w:asciiTheme="minorHAnsi" w:hAnsiTheme="minorHAnsi" w:cstheme="minorHAnsi"/>
+          <w:sz w:val="22"/>
+          <w:szCs w:val="22"/>
+        </w:rPr>
+        <w:t>are</w:t>
+      </w:r>
+      <w:r>
+        <w:rPr>
+          <w:rFonts w:asciiTheme="minorHAnsi" w:hAnsiTheme="minorHAnsi" w:cstheme="minorHAnsi"/>
+          <w:sz w:val="22"/>
+          <w:szCs w:val="22"/>
+        </w:rPr>
+        <w:t xml:space="preserve"> already adjusted to the time zone</w:t>
       </w:r>
       <w:r>
         <w:rPr>
@@ -24358,7 +24551,23 @@
           <w:sz w:val="22"/>
           <w:szCs w:val="22"/>
         </w:rPr>
-        <w:t>The NTP server provides only standart UTC time. It never adjusts for Summer or Winter time. It does not care about time zones. All of that</w:t>
+        <w:t xml:space="preserve">The </w:t>
+      </w:r>
+      <w:r>
+        <w:rPr>
+          <w:rFonts w:asciiTheme="minorHAnsi" w:hAnsiTheme="minorHAnsi" w:cstheme="minorHAnsi"/>
+          <w:sz w:val="22"/>
+          <w:szCs w:val="22"/>
+        </w:rPr>
+        <w:t>Intra</w:t>
+      </w:r>
+      <w:r>
+        <w:rPr>
+          <w:rFonts w:asciiTheme="minorHAnsi" w:hAnsiTheme="minorHAnsi" w:cstheme="minorHAnsi"/>
+          <w:sz w:val="22"/>
+          <w:szCs w:val="22"/>
+        </w:rPr>
+        <w:t xml:space="preserve"> server provides only standart UTC time. It never adjusts for Summer or Winter time. It does not care about time zones. All of that</w:t>
       </w:r>
       <w:r>
         <w:rPr>
@@ -24374,42 +24583,571 @@
           <w:sz w:val="22"/>
           <w:szCs w:val="22"/>
         </w:rPr>
-        <w:t xml:space="preserve"> is handled on the device by the Time library.</w:t>
-      </w:r>
-    </w:p>
-    <w:p>
-      <w:pPr>
-        <w:rPr>
-          <w:rFonts w:asciiTheme="minorHAnsi" w:hAnsiTheme="minorHAnsi" w:cstheme="minorHAnsi"/>
-          <w:sz w:val="22"/>
-          <w:szCs w:val="22"/>
-        </w:rPr>
-      </w:pPr>
-    </w:p>
-    <w:p>
-      <w:pPr>
-        <w:rPr>
-          <w:rFonts w:asciiTheme="minorHAnsi" w:hAnsiTheme="minorHAnsi" w:cstheme="minorHAnsi"/>
-          <w:sz w:val="22"/>
-          <w:szCs w:val="22"/>
-          <w:lang w:val="en-GB"/>
-        </w:rPr>
-      </w:pPr>
-      <w:r>
-        <w:rPr>
-          <w:rFonts w:asciiTheme="minorHAnsi" w:hAnsiTheme="minorHAnsi" w:cstheme="minorHAnsi"/>
-          <w:sz w:val="22"/>
-          <w:szCs w:val="22"/>
-        </w:rPr>
-        <w:t xml:space="preserve">The Intra server behaves differently </w:t>
-      </w:r>
-      <w:r>
-        <w:rPr>
-          <w:rFonts w:asciiTheme="minorHAnsi" w:hAnsiTheme="minorHAnsi" w:cstheme="minorHAnsi"/>
-          <w:sz w:val="22"/>
-          <w:szCs w:val="22"/>
-        </w:rPr>
-        <w:t>–</w:t>
+        <w:t xml:space="preserve"> is handled on the device by the </w:t>
+      </w:r>
+      <w:r>
+        <w:rPr>
+          <w:rFonts w:asciiTheme="minorHAnsi" w:hAnsiTheme="minorHAnsi" w:cstheme="minorHAnsi"/>
+          <w:sz w:val="22"/>
+          <w:szCs w:val="22"/>
+        </w:rPr>
+        <w:t>get_and_ensure_current_time()</w:t>
+      </w:r>
+      <w:r>
+        <w:rPr>
+          <w:rFonts w:asciiTheme="minorHAnsi" w:hAnsiTheme="minorHAnsi" w:cstheme="minorHAnsi"/>
+          <w:sz w:val="22"/>
+          <w:szCs w:val="22"/>
+        </w:rPr>
+        <w:t xml:space="preserve"> function</w:t>
+      </w:r>
+      <w:r>
+        <w:rPr>
+          <w:rFonts w:asciiTheme="minorHAnsi" w:hAnsiTheme="minorHAnsi" w:cstheme="minorHAnsi"/>
+          <w:sz w:val="22"/>
+          <w:szCs w:val="22"/>
+        </w:rPr>
+        <w:t xml:space="preserve"> and its helper functions: </w:t>
+      </w:r>
+      <w:r>
+        <w:rPr>
+          <w:rFonts w:asciiTheme="minorHAnsi" w:hAnsiTheme="minorHAnsi" w:cstheme="minorHAnsi"/>
+          <w:sz w:val="22"/>
+          <w:szCs w:val="22"/>
+        </w:rPr>
+        <w:t>winter_summer_time_offset()</w:t>
+      </w:r>
+      <w:r>
+        <w:rPr>
+          <w:rFonts w:asciiTheme="minorHAnsi" w:hAnsiTheme="minorHAnsi" w:cstheme="minorHAnsi"/>
+          <w:sz w:val="22"/>
+          <w:szCs w:val="22"/>
+        </w:rPr>
+        <w:t xml:space="preserve">, </w:t>
+      </w:r>
+      <w:r>
+        <w:rPr>
+          <w:rFonts w:asciiTheme="minorHAnsi" w:hAnsiTheme="minorHAnsi" w:cstheme="minorHAnsi"/>
+          <w:sz w:val="22"/>
+          <w:szCs w:val="22"/>
+        </w:rPr>
+        <w:t>last_sunday()</w:t>
+      </w:r>
+      <w:r>
+        <w:rPr>
+          <w:rFonts w:asciiTheme="minorHAnsi" w:hAnsiTheme="minorHAnsi" w:cstheme="minorHAnsi"/>
+          <w:sz w:val="22"/>
+          <w:szCs w:val="22"/>
+        </w:rPr>
+        <w:t xml:space="preserve"> and </w:t>
+      </w:r>
+      <w:r>
+        <w:rPr>
+          <w:rFonts w:asciiTheme="minorHAnsi" w:hAnsiTheme="minorHAnsi" w:cstheme="minorHAnsi"/>
+          <w:sz w:val="22"/>
+          <w:szCs w:val="22"/>
+        </w:rPr>
+        <w:t>is_weekday(</w:t>
+      </w:r>
+      <w:r>
+        <w:rPr>
+          <w:rFonts w:asciiTheme="minorHAnsi" w:hAnsiTheme="minorHAnsi" w:cstheme="minorHAnsi"/>
+          <w:sz w:val="22"/>
+          <w:szCs w:val="22"/>
+        </w:rPr>
+        <w:t>)</w:t>
+      </w:r>
+      <w:r>
+        <w:rPr>
+          <w:rFonts w:asciiTheme="minorHAnsi" w:hAnsiTheme="minorHAnsi" w:cstheme="minorHAnsi"/>
+          <w:sz w:val="22"/>
+          <w:szCs w:val="22"/>
+        </w:rPr>
+        <w:t>.</w:t>
+      </w:r>
+    </w:p>
+    <w:p>
+      <w:pPr>
+        <w:rPr>
+          <w:rFonts w:asciiTheme="minorHAnsi" w:hAnsiTheme="minorHAnsi" w:cstheme="minorHAnsi"/>
+          <w:sz w:val="22"/>
+          <w:szCs w:val="22"/>
+        </w:rPr>
+      </w:pPr>
+    </w:p>
+    <w:p>
+      <w:pPr>
+        <w:rPr>
+          <w:rFonts w:asciiTheme="minorHAnsi" w:hAnsiTheme="minorHAnsi" w:cstheme="minorHAnsi"/>
+          <w:sz w:val="22"/>
+          <w:szCs w:val="22"/>
+        </w:rPr>
+      </w:pPr>
+      <w:r>
+        <w:rPr>
+          <w:rFonts w:asciiTheme="minorHAnsi" w:hAnsiTheme="minorHAnsi" w:cstheme="minorHAnsi"/>
+          <w:sz w:val="22"/>
+          <w:szCs w:val="22"/>
+        </w:rPr>
+        <w:t xml:space="preserve">It is important to mention that the </w:t>
+      </w:r>
+      <w:r>
+        <w:rPr>
+          <w:rFonts w:asciiTheme="minorHAnsi" w:hAnsiTheme="minorHAnsi" w:cstheme="minorHAnsi"/>
+          <w:sz w:val="22"/>
+          <w:szCs w:val="22"/>
+        </w:rPr>
+        <w:t>winter_summer_time_offset()</w:t>
+      </w:r>
+      <w:r>
+        <w:rPr>
+          <w:rFonts w:asciiTheme="minorHAnsi" w:hAnsiTheme="minorHAnsi" w:cstheme="minorHAnsi"/>
+          <w:sz w:val="22"/>
+          <w:szCs w:val="22"/>
+        </w:rPr>
+        <w:t xml:space="preserve"> function calculates when to switch between summer and winter time based on the </w:t>
+      </w:r>
+      <w:r>
+        <w:rPr>
+          <w:rFonts w:asciiTheme="minorHAnsi" w:hAnsiTheme="minorHAnsi" w:cstheme="minorHAnsi"/>
+          <w:sz w:val="22"/>
+          <w:szCs w:val="22"/>
+        </w:rPr>
+        <w:t xml:space="preserve">pattern of the </w:t>
+      </w:r>
+      <w:r>
+        <w:rPr>
+          <w:rFonts w:asciiTheme="minorHAnsi" w:hAnsiTheme="minorHAnsi" w:cstheme="minorHAnsi"/>
+          <w:sz w:val="22"/>
+          <w:szCs w:val="22"/>
+        </w:rPr>
+        <w:t>European</w:t>
+      </w:r>
+      <w:r>
+        <w:rPr>
+          <w:rFonts w:asciiTheme="minorHAnsi" w:hAnsiTheme="minorHAnsi" w:cstheme="minorHAnsi"/>
+          <w:sz w:val="22"/>
+          <w:szCs w:val="22"/>
+        </w:rPr>
+        <w:t xml:space="preserve"> Union DST system</w:t>
+      </w:r>
+      <w:r>
+        <w:rPr>
+          <w:rFonts w:asciiTheme="minorHAnsi" w:hAnsiTheme="minorHAnsi" w:cstheme="minorHAnsi"/>
+          <w:sz w:val="22"/>
+          <w:szCs w:val="22"/>
+        </w:rPr>
+        <w:t xml:space="preserve">. </w:t>
+      </w:r>
+      <w:r>
+        <w:rPr>
+          <w:rFonts w:asciiTheme="minorHAnsi" w:hAnsiTheme="minorHAnsi" w:cstheme="minorHAnsi"/>
+          <w:b/>
+          <w:bCs/>
+          <w:i/>
+          <w:iCs/>
+          <w:sz w:val="22"/>
+          <w:szCs w:val="22"/>
+        </w:rPr>
+        <w:t>It may not be suitable for the countries outside of the EU!</w:t>
+      </w:r>
+      <w:r>
+        <w:rPr>
+          <w:rFonts w:asciiTheme="minorHAnsi" w:hAnsiTheme="minorHAnsi" w:cstheme="minorHAnsi"/>
+          <w:sz w:val="22"/>
+          <w:szCs w:val="22"/>
+        </w:rPr>
+        <w:t xml:space="preserve"> The </w:t>
+      </w:r>
+      <w:r>
+        <w:rPr>
+          <w:rFonts w:asciiTheme="minorHAnsi" w:hAnsiTheme="minorHAnsi" w:cstheme="minorHAnsi"/>
+          <w:sz w:val="22"/>
+          <w:szCs w:val="22"/>
+        </w:rPr>
+        <w:t>pattern</w:t>
+      </w:r>
+      <w:r>
+        <w:rPr>
+          <w:rFonts w:asciiTheme="minorHAnsi" w:hAnsiTheme="minorHAnsi" w:cstheme="minorHAnsi"/>
+          <w:sz w:val="22"/>
+          <w:szCs w:val="22"/>
+        </w:rPr>
+        <w:t xml:space="preserve"> that the function obeys </w:t>
+      </w:r>
+      <w:r>
+        <w:rPr>
+          <w:rFonts w:asciiTheme="minorHAnsi" w:hAnsiTheme="minorHAnsi" w:cstheme="minorHAnsi"/>
+          <w:sz w:val="22"/>
+          <w:szCs w:val="22"/>
+        </w:rPr>
+        <w:t>is</w:t>
+      </w:r>
+      <w:r>
+        <w:rPr>
+          <w:rFonts w:asciiTheme="minorHAnsi" w:hAnsiTheme="minorHAnsi" w:cstheme="minorHAnsi"/>
+          <w:sz w:val="22"/>
+          <w:szCs w:val="22"/>
+        </w:rPr>
+        <w:t xml:space="preserve"> the following:</w:t>
+      </w:r>
+    </w:p>
+    <w:p>
+      <w:pPr>
+        <w:pStyle w:val="Odstavecseseznamem"/>
+        <w:numPr>
+          <w:ilvl w:val="0"/>
+          <w:numId w:val="44"/>
+        </w:numPr>
+        <w:rPr>
+          <w:rFonts w:cstheme="minorHAnsi"/>
+        </w:rPr>
+      </w:pPr>
+      <w:r>
+        <w:rPr>
+          <w:rFonts w:cstheme="minorHAnsi"/>
+        </w:rPr>
+        <w:t xml:space="preserve">last Sunday of March </w:t>
+      </w:r>
+      <w:r>
+        <w:rPr>
+          <w:rFonts w:cstheme="minorHAnsi"/>
+        </w:rPr>
+        <w:t>—</w:t>
+      </w:r>
+      <w:r>
+        <w:rPr>
+          <w:rFonts w:cstheme="minorHAnsi"/>
+        </w:rPr>
+        <w:t xml:space="preserve"> switch to summer time</w:t>
+      </w:r>
+      <w:r>
+        <w:rPr>
+          <w:rFonts w:cstheme="minorHAnsi"/>
+        </w:rPr>
+        <w:t>,</w:t>
+      </w:r>
+    </w:p>
+    <w:p>
+      <w:pPr>
+        <w:pStyle w:val="Odstavecseseznamem"/>
+        <w:numPr>
+          <w:ilvl w:val="0"/>
+          <w:numId w:val="44"/>
+        </w:numPr>
+        <w:rPr>
+          <w:rFonts w:cstheme="minorHAnsi"/>
+        </w:rPr>
+      </w:pPr>
+      <w:r>
+        <w:rPr>
+          <w:rFonts w:cstheme="minorHAnsi"/>
+        </w:rPr>
+        <w:t xml:space="preserve">last Sunday of October </w:t>
+      </w:r>
+      <w:r>
+        <w:rPr>
+          <w:rFonts w:cstheme="minorHAnsi"/>
+        </w:rPr>
+        <w:t xml:space="preserve">— </w:t>
+      </w:r>
+      <w:r>
+        <w:rPr>
+          <w:rFonts w:cstheme="minorHAnsi"/>
+        </w:rPr>
+        <w:t>switch back to winter time</w:t>
+      </w:r>
+      <w:r>
+        <w:rPr>
+          <w:rFonts w:cstheme="minorHAnsi"/>
+        </w:rPr>
+        <w:t>.</w:t>
+      </w:r>
+    </w:p>
+    <w:p>
+      <w:pPr>
+        <w:rPr>
+          <w:rFonts w:asciiTheme="minorHAnsi" w:hAnsiTheme="minorHAnsi" w:cstheme="minorHAnsi"/>
+          <w:sz w:val="22"/>
+          <w:szCs w:val="22"/>
+        </w:rPr>
+      </w:pPr>
+    </w:p>
+    <w:p>
+      <w:pPr>
+        <w:rPr>
+          <w:rFonts w:asciiTheme="minorHAnsi" w:hAnsiTheme="minorHAnsi" w:cstheme="minorHAnsi"/>
+          <w:sz w:val="22"/>
+          <w:szCs w:val="22"/>
+        </w:rPr>
+      </w:pPr>
+      <w:r>
+        <w:rPr>
+          <w:rFonts w:asciiTheme="minorHAnsi" w:hAnsiTheme="minorHAnsi" w:cstheme="minorHAnsi"/>
+          <w:sz w:val="22"/>
+          <w:szCs w:val="22"/>
+        </w:rPr>
+        <w:t xml:space="preserve">Located in the config.h file, there is a very important time-related macro </w:t>
+      </w:r>
+      <w:r>
+        <w:rPr>
+          <w:rFonts w:asciiTheme="minorHAnsi" w:hAnsiTheme="minorHAnsi" w:cstheme="minorHAnsi"/>
+          <w:sz w:val="22"/>
+          <w:szCs w:val="22"/>
+        </w:rPr>
+        <w:t>TIME_ZONE</w:t>
+      </w:r>
+      <w:r>
+        <w:rPr>
+          <w:rFonts w:asciiTheme="minorHAnsi" w:hAnsiTheme="minorHAnsi" w:cstheme="minorHAnsi"/>
+          <w:sz w:val="22"/>
+          <w:szCs w:val="22"/>
+        </w:rPr>
+        <w:t xml:space="preserve">. This macro is the place where you have to manually write the time zone of </w:t>
+      </w:r>
+      <w:r>
+        <w:rPr>
+          <w:rFonts w:asciiTheme="minorHAnsi" w:hAnsiTheme="minorHAnsi" w:cstheme="minorHAnsi"/>
+          <w:sz w:val="22"/>
+          <w:szCs w:val="22"/>
+        </w:rPr>
+        <w:t>the</w:t>
+      </w:r>
+      <w:r>
+        <w:rPr>
+          <w:rFonts w:asciiTheme="minorHAnsi" w:hAnsiTheme="minorHAnsi" w:cstheme="minorHAnsi"/>
+          <w:sz w:val="22"/>
+          <w:szCs w:val="22"/>
+        </w:rPr>
+        <w:t xml:space="preserve"> campus</w:t>
+      </w:r>
+      <w:r>
+        <w:rPr>
+          <w:rFonts w:asciiTheme="minorHAnsi" w:hAnsiTheme="minorHAnsi" w:cstheme="minorHAnsi"/>
+          <w:sz w:val="22"/>
+          <w:szCs w:val="22"/>
+        </w:rPr>
+        <w:t xml:space="preserve"> where you use the Sign</w:t>
+      </w:r>
+      <w:r>
+        <w:rPr>
+          <w:rFonts w:asciiTheme="minorHAnsi" w:hAnsiTheme="minorHAnsi" w:cstheme="minorHAnsi"/>
+          <w:sz w:val="22"/>
+          <w:szCs w:val="22"/>
+        </w:rPr>
+        <w:t xml:space="preserve">. </w:t>
+      </w:r>
+    </w:p>
+    <w:p>
+      <w:pPr>
+        <w:rPr>
+          <w:rFonts w:asciiTheme="minorHAnsi" w:hAnsiTheme="minorHAnsi" w:cstheme="minorHAnsi"/>
+          <w:sz w:val="22"/>
+          <w:szCs w:val="22"/>
+        </w:rPr>
+      </w:pPr>
+    </w:p>
+    <w:p>
+      <w:pPr>
+        <w:rPr>
+          <w:rFonts w:asciiTheme="minorHAnsi" w:hAnsiTheme="minorHAnsi" w:cstheme="minorHAnsi"/>
+          <w:sz w:val="22"/>
+          <w:szCs w:val="22"/>
+        </w:rPr>
+      </w:pPr>
+      <w:r>
+        <w:rPr>
+          <w:rFonts w:asciiTheme="minorHAnsi" w:hAnsiTheme="minorHAnsi" w:cstheme="minorHAnsi"/>
+          <w:sz w:val="22"/>
+          <w:szCs w:val="22"/>
+        </w:rPr>
+        <w:t>Be aware, that i</w:t>
+      </w:r>
+      <w:r>
+        <w:rPr>
+          <w:rFonts w:asciiTheme="minorHAnsi" w:hAnsiTheme="minorHAnsi" w:cstheme="minorHAnsi"/>
+          <w:sz w:val="22"/>
+          <w:szCs w:val="22"/>
+        </w:rPr>
+        <w:t xml:space="preserve">f your country switches between </w:t>
+      </w:r>
+      <w:r>
+        <w:rPr>
+          <w:rFonts w:asciiTheme="minorHAnsi" w:hAnsiTheme="minorHAnsi" w:cstheme="minorHAnsi"/>
+          <w:sz w:val="22"/>
+          <w:szCs w:val="22"/>
+        </w:rPr>
+        <w:t xml:space="preserve">winter/summer time (DST system), it means that your country basically has two different time zones – one in winter and a different one in summer. Winter time zone is universally considered as the default one. This is why the </w:t>
+      </w:r>
+      <w:r>
+        <w:rPr>
+          <w:rFonts w:asciiTheme="minorHAnsi" w:hAnsiTheme="minorHAnsi" w:cstheme="minorHAnsi"/>
+          <w:sz w:val="22"/>
+          <w:szCs w:val="22"/>
+          <w:u w:val="single"/>
+        </w:rPr>
+        <w:t>winter</w:t>
+      </w:r>
+      <w:r>
+        <w:rPr>
+          <w:rFonts w:asciiTheme="minorHAnsi" w:hAnsiTheme="minorHAnsi" w:cstheme="minorHAnsi"/>
+          <w:sz w:val="22"/>
+          <w:szCs w:val="22"/>
+        </w:rPr>
+        <w:t xml:space="preserve"> time zone is what you need to write in the </w:t>
+      </w:r>
+      <w:r>
+        <w:rPr>
+          <w:rFonts w:asciiTheme="minorHAnsi" w:hAnsiTheme="minorHAnsi" w:cstheme="minorHAnsi"/>
+          <w:sz w:val="22"/>
+          <w:szCs w:val="22"/>
+        </w:rPr>
+        <w:t>TIME_ZONE</w:t>
+      </w:r>
+      <w:r>
+        <w:rPr>
+          <w:rFonts w:asciiTheme="minorHAnsi" w:hAnsiTheme="minorHAnsi" w:cstheme="minorHAnsi"/>
+          <w:sz w:val="22"/>
+          <w:szCs w:val="22"/>
+        </w:rPr>
+        <w:t xml:space="preserve"> macro.</w:t>
+      </w:r>
+    </w:p>
+    <w:p>
+      <w:pPr>
+        <w:rPr>
+          <w:rFonts w:asciiTheme="minorHAnsi" w:hAnsiTheme="minorHAnsi" w:cstheme="minorHAnsi"/>
+          <w:sz w:val="22"/>
+          <w:szCs w:val="22"/>
+        </w:rPr>
+      </w:pPr>
+      <w:r>
+        <w:rPr>
+          <w:rFonts w:asciiTheme="minorHAnsi" w:hAnsiTheme="minorHAnsi" w:cstheme="minorHAnsi"/>
+          <w:sz w:val="22"/>
+          <w:szCs w:val="22"/>
+        </w:rPr>
+        <w:t>E</w:t>
+      </w:r>
+      <w:r>
+        <w:rPr>
+          <w:rFonts w:asciiTheme="minorHAnsi" w:hAnsiTheme="minorHAnsi" w:cstheme="minorHAnsi"/>
+          <w:sz w:val="22"/>
+          <w:szCs w:val="22"/>
+        </w:rPr>
+        <w:t>.g.</w:t>
+      </w:r>
+      <w:r>
+        <w:rPr>
+          <w:rFonts w:asciiTheme="minorHAnsi" w:hAnsiTheme="minorHAnsi" w:cstheme="minorHAnsi"/>
+          <w:sz w:val="22"/>
+          <w:szCs w:val="22"/>
+        </w:rPr>
+        <w:t>:</w:t>
+      </w:r>
+      <w:r>
+        <w:rPr>
+          <w:rFonts w:asciiTheme="minorHAnsi" w:hAnsiTheme="minorHAnsi" w:cstheme="minorHAnsi"/>
+          <w:sz w:val="22"/>
+          <w:szCs w:val="22"/>
+        </w:rPr>
+        <w:t xml:space="preserve"> in winter</w:t>
+      </w:r>
+      <w:r>
+        <w:rPr>
+          <w:rFonts w:asciiTheme="minorHAnsi" w:hAnsiTheme="minorHAnsi" w:cstheme="minorHAnsi"/>
+          <w:sz w:val="22"/>
+          <w:szCs w:val="22"/>
+        </w:rPr>
+        <w:t>,</w:t>
+      </w:r>
+      <w:r>
+        <w:rPr>
+          <w:rFonts w:asciiTheme="minorHAnsi" w:hAnsiTheme="minorHAnsi" w:cstheme="minorHAnsi"/>
+          <w:sz w:val="22"/>
+          <w:szCs w:val="22"/>
+        </w:rPr>
+        <w:t xml:space="preserve"> France uses </w:t>
+      </w:r>
+      <w:r>
+        <w:rPr>
+          <w:rFonts w:asciiTheme="minorHAnsi" w:hAnsiTheme="minorHAnsi" w:cstheme="minorHAnsi"/>
+          <w:sz w:val="22"/>
+          <w:szCs w:val="22"/>
+        </w:rPr>
+        <w:t>Central European Time</w:t>
+      </w:r>
+      <w:r>
+        <w:rPr>
+          <w:rFonts w:asciiTheme="minorHAnsi" w:hAnsiTheme="minorHAnsi" w:cstheme="minorHAnsi"/>
+          <w:sz w:val="22"/>
+          <w:szCs w:val="22"/>
+        </w:rPr>
+        <w:t xml:space="preserve"> and has the </w:t>
+      </w:r>
+      <w:r>
+        <w:rPr>
+          <w:rFonts w:asciiTheme="minorHAnsi" w:hAnsiTheme="minorHAnsi" w:cstheme="minorHAnsi"/>
+          <w:sz w:val="22"/>
+          <w:szCs w:val="22"/>
+        </w:rPr>
+        <w:t>UTC+1</w:t>
+      </w:r>
+      <w:r>
+        <w:rPr>
+          <w:rFonts w:asciiTheme="minorHAnsi" w:hAnsiTheme="minorHAnsi" w:cstheme="minorHAnsi"/>
+          <w:sz w:val="22"/>
+          <w:szCs w:val="22"/>
+        </w:rPr>
+        <w:t xml:space="preserve"> time zone; but in summer France uses </w:t>
+      </w:r>
+      <w:r>
+        <w:rPr>
+          <w:rFonts w:asciiTheme="minorHAnsi" w:hAnsiTheme="minorHAnsi" w:cstheme="minorHAnsi"/>
+          <w:sz w:val="22"/>
+          <w:szCs w:val="22"/>
+        </w:rPr>
+        <w:t>Central European</w:t>
+      </w:r>
+      <w:r>
+        <w:rPr>
+          <w:rFonts w:asciiTheme="minorHAnsi" w:hAnsiTheme="minorHAnsi" w:cstheme="minorHAnsi"/>
+          <w:sz w:val="22"/>
+          <w:szCs w:val="22"/>
+        </w:rPr>
+        <w:t xml:space="preserve"> Summer</w:t>
+      </w:r>
+      <w:r>
+        <w:rPr>
+          <w:rFonts w:asciiTheme="minorHAnsi" w:hAnsiTheme="minorHAnsi" w:cstheme="minorHAnsi"/>
+          <w:sz w:val="22"/>
+          <w:szCs w:val="22"/>
+        </w:rPr>
+        <w:t xml:space="preserve"> Time</w:t>
+      </w:r>
+      <w:r>
+        <w:rPr>
+          <w:rFonts w:asciiTheme="minorHAnsi" w:hAnsiTheme="minorHAnsi" w:cstheme="minorHAnsi"/>
+          <w:sz w:val="22"/>
+          <w:szCs w:val="22"/>
+        </w:rPr>
+        <w:t xml:space="preserve"> and has the </w:t>
+      </w:r>
+      <w:r>
+        <w:rPr>
+          <w:rFonts w:asciiTheme="minorHAnsi" w:hAnsiTheme="minorHAnsi" w:cstheme="minorHAnsi"/>
+          <w:sz w:val="22"/>
+          <w:szCs w:val="22"/>
+        </w:rPr>
+        <w:t>UTC+</w:t>
+      </w:r>
+      <w:r>
+        <w:rPr>
+          <w:rFonts w:asciiTheme="minorHAnsi" w:hAnsiTheme="minorHAnsi" w:cstheme="minorHAnsi"/>
+          <w:sz w:val="22"/>
+          <w:szCs w:val="22"/>
+        </w:rPr>
+        <w:t>2 time zone.</w:t>
       </w:r>
       <w:r>
         <w:rPr>
@@ -24425,158 +25163,21 @@
           <w:sz w:val="22"/>
           <w:szCs w:val="22"/>
         </w:rPr>
-        <w:t>it always switches between Summer and Winter time automatically and sends already adjusted time, so we do not have to care about this part. However, the Intra server does not care about time zones and additionally uses the time zone of its actual location</w:t>
-      </w:r>
-      <w:r>
-        <w:rPr>
-          <w:rFonts w:asciiTheme="minorHAnsi" w:hAnsiTheme="minorHAnsi" w:cstheme="minorHAnsi"/>
-          <w:sz w:val="22"/>
-          <w:szCs w:val="22"/>
-        </w:rPr>
-        <w:t xml:space="preserve"> (</w:t>
-      </w:r>
-      <w:r>
-        <w:rPr>
-          <w:rFonts w:asciiTheme="minorHAnsi" w:hAnsiTheme="minorHAnsi" w:cstheme="minorHAnsi"/>
-          <w:sz w:val="22"/>
-          <w:szCs w:val="22"/>
-        </w:rPr>
-        <w:t>UTC+1</w:t>
-      </w:r>
-      <w:r>
-        <w:rPr>
-          <w:rFonts w:asciiTheme="minorHAnsi" w:hAnsiTheme="minorHAnsi" w:cstheme="minorHAnsi"/>
-          <w:sz w:val="22"/>
-          <w:szCs w:val="22"/>
-        </w:rPr>
-        <w:t xml:space="preserve"> — </w:t>
-      </w:r>
-      <w:r>
-        <w:rPr>
-          <w:rFonts w:asciiTheme="minorHAnsi" w:hAnsiTheme="minorHAnsi" w:cstheme="minorHAnsi"/>
-          <w:sz w:val="22"/>
-          <w:szCs w:val="22"/>
-        </w:rPr>
-        <w:t>CET</w:t>
-      </w:r>
-      <w:r>
-        <w:rPr>
-          <w:rFonts w:asciiTheme="minorHAnsi" w:hAnsiTheme="minorHAnsi" w:cstheme="minorHAnsi"/>
-          <w:sz w:val="22"/>
-          <w:szCs w:val="22"/>
-        </w:rPr>
-        <w:t xml:space="preserve">, </w:t>
-      </w:r>
-      <w:r>
-        <w:rPr>
-          <w:rFonts w:asciiTheme="minorHAnsi" w:hAnsiTheme="minorHAnsi" w:cstheme="minorHAnsi"/>
-          <w:sz w:val="22"/>
-          <w:szCs w:val="22"/>
-        </w:rPr>
-        <w:t>Central European Time</w:t>
-      </w:r>
-      <w:r>
-        <w:rPr>
-          <w:rFonts w:asciiTheme="minorHAnsi" w:hAnsiTheme="minorHAnsi" w:cstheme="minorHAnsi"/>
-          <w:sz w:val="22"/>
-          <w:szCs w:val="22"/>
-        </w:rPr>
-        <w:t xml:space="preserve"> in winter and </w:t>
-      </w:r>
-      <w:r>
-        <w:rPr>
-          <w:rFonts w:asciiTheme="minorHAnsi" w:hAnsiTheme="minorHAnsi" w:cstheme="minorHAnsi"/>
-          <w:sz w:val="22"/>
-          <w:szCs w:val="22"/>
-        </w:rPr>
-        <w:t>UTC+</w:t>
-      </w:r>
-      <w:r>
-        <w:rPr>
-          <w:rFonts w:asciiTheme="minorHAnsi" w:hAnsiTheme="minorHAnsi" w:cstheme="minorHAnsi"/>
-          <w:sz w:val="22"/>
-          <w:szCs w:val="22"/>
-        </w:rPr>
-        <w:t xml:space="preserve">2 — </w:t>
-      </w:r>
-      <w:r>
-        <w:rPr>
-          <w:rFonts w:asciiTheme="minorHAnsi" w:hAnsiTheme="minorHAnsi" w:cstheme="minorHAnsi"/>
-          <w:sz w:val="22"/>
-          <w:szCs w:val="22"/>
-        </w:rPr>
-        <w:t>CE</w:t>
-      </w:r>
-      <w:r>
-        <w:rPr>
-          <w:rFonts w:asciiTheme="minorHAnsi" w:hAnsiTheme="minorHAnsi" w:cstheme="minorHAnsi"/>
-          <w:sz w:val="22"/>
-          <w:szCs w:val="22"/>
-        </w:rPr>
-        <w:t>S</w:t>
-      </w:r>
-      <w:r>
-        <w:rPr>
-          <w:rFonts w:asciiTheme="minorHAnsi" w:hAnsiTheme="minorHAnsi" w:cstheme="minorHAnsi"/>
-          <w:sz w:val="22"/>
-          <w:szCs w:val="22"/>
-        </w:rPr>
-        <w:t>T</w:t>
-      </w:r>
-      <w:r>
-        <w:rPr>
-          <w:rFonts w:asciiTheme="minorHAnsi" w:hAnsiTheme="minorHAnsi" w:cstheme="minorHAnsi"/>
-          <w:sz w:val="22"/>
-          <w:szCs w:val="22"/>
-        </w:rPr>
-        <w:t xml:space="preserve">, </w:t>
-      </w:r>
-      <w:r>
-        <w:rPr>
-          <w:rFonts w:asciiTheme="minorHAnsi" w:hAnsiTheme="minorHAnsi" w:cstheme="minorHAnsi"/>
-          <w:sz w:val="22"/>
-          <w:szCs w:val="22"/>
-        </w:rPr>
-        <w:t>Central European</w:t>
-      </w:r>
-      <w:r>
-        <w:rPr>
-          <w:rFonts w:asciiTheme="minorHAnsi" w:hAnsiTheme="minorHAnsi" w:cstheme="minorHAnsi"/>
-          <w:sz w:val="22"/>
-          <w:szCs w:val="22"/>
-        </w:rPr>
-        <w:t xml:space="preserve"> Summer</w:t>
-      </w:r>
-      <w:r>
-        <w:rPr>
-          <w:rFonts w:asciiTheme="minorHAnsi" w:hAnsiTheme="minorHAnsi" w:cstheme="minorHAnsi"/>
-          <w:sz w:val="22"/>
-          <w:szCs w:val="22"/>
-        </w:rPr>
-        <w:t xml:space="preserve"> Time</w:t>
-      </w:r>
-      <w:r>
-        <w:rPr>
-          <w:rFonts w:asciiTheme="minorHAnsi" w:hAnsiTheme="minorHAnsi" w:cstheme="minorHAnsi"/>
-          <w:sz w:val="22"/>
-          <w:szCs w:val="22"/>
-        </w:rPr>
-        <w:t xml:space="preserve"> in summer</w:t>
-      </w:r>
-      <w:r>
-        <w:rPr>
-          <w:rFonts w:asciiTheme="minorHAnsi" w:hAnsiTheme="minorHAnsi" w:cstheme="minorHAnsi"/>
-          <w:sz w:val="22"/>
-          <w:szCs w:val="22"/>
-        </w:rPr>
-        <w:t>) forcing the device to adjust to it locally.</w:t>
-      </w:r>
-      <w:r>
-        <w:rPr>
-          <w:rFonts w:asciiTheme="minorHAnsi" w:hAnsiTheme="minorHAnsi" w:cstheme="minorHAnsi"/>
-          <w:sz w:val="22"/>
-          <w:szCs w:val="22"/>
-          <w:lang w:val="en-US"/>
+        <w:t xml:space="preserve">Winter time zone is the default one, this is why for any French campus </w:t>
+      </w:r>
+      <w:r>
+        <w:rPr>
+          <w:rFonts w:asciiTheme="minorHAnsi" w:hAnsiTheme="minorHAnsi" w:cstheme="minorHAnsi"/>
+          <w:sz w:val="22"/>
+          <w:szCs w:val="22"/>
+        </w:rPr>
+        <w:t>TIME_ZONE</w:t>
+      </w:r>
+      <w:r>
+        <w:rPr>
+          <w:rFonts w:asciiTheme="minorHAnsi" w:hAnsiTheme="minorHAnsi" w:cstheme="minorHAnsi"/>
+          <w:sz w:val="22"/>
+          <w:szCs w:val="22"/>
         </w:rPr>
         <w:t xml:space="preserve"> </w:t>
       </w:r>
@@ -24586,373 +25187,57 @@
           <w:sz w:val="22"/>
           <w:szCs w:val="22"/>
         </w:rPr>
-        <w:t xml:space="preserve">Time zone adjustment happens in the </w:t>
-      </w:r>
-      <w:r>
-        <w:rPr>
-          <w:rFonts w:asciiTheme="minorHAnsi" w:hAnsiTheme="minorHAnsi" w:cstheme="minorHAnsi"/>
-          <w:sz w:val="22"/>
-          <w:szCs w:val="22"/>
-        </w:rPr>
-        <w:t>get_exam_time(</w:t>
-      </w:r>
-      <w:r>
-        <w:rPr>
-          <w:rFonts w:asciiTheme="minorHAnsi" w:hAnsiTheme="minorHAnsi" w:cstheme="minorHAnsi"/>
-          <w:sz w:val="22"/>
-          <w:szCs w:val="22"/>
-          <w:lang w:val="en-GB"/>
-        </w:rPr>
-        <w:t>) function.</w:t>
-      </w:r>
-    </w:p>
-    <w:p>
-      <w:pPr>
-        <w:rPr>
-          <w:rFonts w:asciiTheme="minorHAnsi" w:hAnsiTheme="minorHAnsi" w:cstheme="minorHAnsi"/>
-          <w:sz w:val="22"/>
-          <w:szCs w:val="22"/>
-        </w:rPr>
-      </w:pPr>
-    </w:p>
-    <w:p>
-      <w:pPr>
-        <w:rPr>
-          <w:rFonts w:asciiTheme="minorHAnsi" w:hAnsiTheme="minorHAnsi" w:cstheme="minorHAnsi"/>
-          <w:sz w:val="22"/>
-          <w:szCs w:val="22"/>
-        </w:rPr>
-      </w:pPr>
-      <w:r>
-        <w:rPr>
-          <w:rFonts w:asciiTheme="minorHAnsi" w:hAnsiTheme="minorHAnsi" w:cstheme="minorHAnsi"/>
-          <w:sz w:val="22"/>
-          <w:szCs w:val="22"/>
-        </w:rPr>
-        <w:t xml:space="preserve">Since the Intra server provides not only exam time, but also actual time, it is possible to refactor the project to use the Intra server as the sole source for all the time-related data. The need </w:t>
-      </w:r>
-      <w:r>
-        <w:rPr>
-          <w:rFonts w:asciiTheme="minorHAnsi" w:hAnsiTheme="minorHAnsi" w:cstheme="minorHAnsi"/>
-          <w:sz w:val="22"/>
-          <w:szCs w:val="22"/>
-        </w:rPr>
-        <w:t>of adjusting for time zones applies.</w:t>
-      </w:r>
-    </w:p>
-    <w:p>
-      <w:pPr>
-        <w:rPr>
-          <w:rFonts w:asciiTheme="minorHAnsi" w:hAnsiTheme="minorHAnsi" w:cstheme="minorHAnsi"/>
-          <w:sz w:val="22"/>
-          <w:szCs w:val="22"/>
-        </w:rPr>
-      </w:pPr>
-    </w:p>
-    <w:p>
-      <w:pPr>
-        <w:rPr>
-          <w:rFonts w:asciiTheme="minorHAnsi" w:hAnsiTheme="minorHAnsi" w:cstheme="minorHAnsi"/>
-          <w:sz w:val="22"/>
-          <w:szCs w:val="22"/>
-        </w:rPr>
-      </w:pPr>
-      <w:r>
-        <w:rPr>
-          <w:rFonts w:asciiTheme="minorHAnsi" w:hAnsiTheme="minorHAnsi" w:cstheme="minorHAnsi"/>
-          <w:sz w:val="22"/>
-          <w:szCs w:val="22"/>
-        </w:rPr>
-        <w:t xml:space="preserve">Located in the config.h file, there is a very important time-related macro </w:t>
-      </w:r>
-      <w:r>
-        <w:rPr>
-          <w:rFonts w:asciiTheme="minorHAnsi" w:hAnsiTheme="minorHAnsi" w:cstheme="minorHAnsi"/>
-          <w:sz w:val="22"/>
-          <w:szCs w:val="22"/>
-        </w:rPr>
-        <w:t>TIME_ZONE</w:t>
-      </w:r>
-      <w:r>
-        <w:rPr>
-          <w:rFonts w:asciiTheme="minorHAnsi" w:hAnsiTheme="minorHAnsi" w:cstheme="minorHAnsi"/>
-          <w:sz w:val="22"/>
-          <w:szCs w:val="22"/>
-        </w:rPr>
-        <w:t xml:space="preserve">. This macro is the place where you have to manually write the time zone of </w:t>
-      </w:r>
-      <w:r>
-        <w:rPr>
-          <w:rFonts w:asciiTheme="minorHAnsi" w:hAnsiTheme="minorHAnsi" w:cstheme="minorHAnsi"/>
-          <w:sz w:val="22"/>
-          <w:szCs w:val="22"/>
-        </w:rPr>
-        <w:t>the</w:t>
-      </w:r>
-      <w:r>
-        <w:rPr>
-          <w:rFonts w:asciiTheme="minorHAnsi" w:hAnsiTheme="minorHAnsi" w:cstheme="minorHAnsi"/>
-          <w:sz w:val="22"/>
-          <w:szCs w:val="22"/>
-        </w:rPr>
-        <w:t xml:space="preserve"> campus</w:t>
-      </w:r>
-      <w:r>
-        <w:rPr>
-          <w:rFonts w:asciiTheme="minorHAnsi" w:hAnsiTheme="minorHAnsi" w:cstheme="minorHAnsi"/>
-          <w:sz w:val="22"/>
-          <w:szCs w:val="22"/>
-        </w:rPr>
-        <w:t xml:space="preserve"> where you use the Sign</w:t>
-      </w:r>
-      <w:r>
-        <w:rPr>
-          <w:rFonts w:asciiTheme="minorHAnsi" w:hAnsiTheme="minorHAnsi" w:cstheme="minorHAnsi"/>
-          <w:sz w:val="22"/>
-          <w:szCs w:val="22"/>
-        </w:rPr>
-        <w:t>. To do that correctly, you should know that for the same one country time zone shift</w:t>
-      </w:r>
-      <w:r>
-        <w:rPr>
-          <w:rFonts w:asciiTheme="minorHAnsi" w:hAnsiTheme="minorHAnsi" w:cstheme="minorHAnsi"/>
-          <w:sz w:val="22"/>
-          <w:szCs w:val="22"/>
-        </w:rPr>
-        <w:t>s</w:t>
-      </w:r>
-      <w:r>
-        <w:rPr>
-          <w:rFonts w:asciiTheme="minorHAnsi" w:hAnsiTheme="minorHAnsi" w:cstheme="minorHAnsi"/>
-          <w:sz w:val="22"/>
-          <w:szCs w:val="22"/>
-        </w:rPr>
-        <w:t xml:space="preserve"> when time gets switched between winter time and summer time</w:t>
-      </w:r>
-      <w:r>
-        <w:rPr>
-          <w:rFonts w:asciiTheme="minorHAnsi" w:hAnsiTheme="minorHAnsi" w:cstheme="minorHAnsi"/>
-          <w:sz w:val="22"/>
-          <w:szCs w:val="22"/>
-        </w:rPr>
-        <w:t>. E</w:t>
-      </w:r>
-      <w:r>
-        <w:rPr>
-          <w:rFonts w:asciiTheme="minorHAnsi" w:hAnsiTheme="minorHAnsi" w:cstheme="minorHAnsi"/>
-          <w:sz w:val="22"/>
-          <w:szCs w:val="22"/>
-        </w:rPr>
-        <w:t>.g.</w:t>
-      </w:r>
-      <w:r>
-        <w:rPr>
-          <w:rFonts w:asciiTheme="minorHAnsi" w:hAnsiTheme="minorHAnsi" w:cstheme="minorHAnsi"/>
-          <w:sz w:val="22"/>
-          <w:szCs w:val="22"/>
-        </w:rPr>
-        <w:t>:</w:t>
-      </w:r>
-      <w:r>
-        <w:rPr>
-          <w:rFonts w:asciiTheme="minorHAnsi" w:hAnsiTheme="minorHAnsi" w:cstheme="minorHAnsi"/>
-          <w:sz w:val="22"/>
-          <w:szCs w:val="22"/>
-        </w:rPr>
-        <w:t xml:space="preserve"> in winter</w:t>
-      </w:r>
-      <w:r>
-        <w:rPr>
-          <w:rFonts w:asciiTheme="minorHAnsi" w:hAnsiTheme="minorHAnsi" w:cstheme="minorHAnsi"/>
-          <w:sz w:val="22"/>
-          <w:szCs w:val="22"/>
-        </w:rPr>
-        <w:t>,</w:t>
-      </w:r>
-      <w:r>
-        <w:rPr>
-          <w:rFonts w:asciiTheme="minorHAnsi" w:hAnsiTheme="minorHAnsi" w:cstheme="minorHAnsi"/>
-          <w:sz w:val="22"/>
-          <w:szCs w:val="22"/>
-        </w:rPr>
-        <w:t xml:space="preserve"> France uses </w:t>
-      </w:r>
-      <w:r>
-        <w:rPr>
-          <w:rFonts w:asciiTheme="minorHAnsi" w:hAnsiTheme="minorHAnsi" w:cstheme="minorHAnsi"/>
-          <w:sz w:val="22"/>
-          <w:szCs w:val="22"/>
-        </w:rPr>
-        <w:t>Central European Time</w:t>
-      </w:r>
-      <w:r>
-        <w:rPr>
-          <w:rFonts w:asciiTheme="minorHAnsi" w:hAnsiTheme="minorHAnsi" w:cstheme="minorHAnsi"/>
-          <w:sz w:val="22"/>
-          <w:szCs w:val="22"/>
-        </w:rPr>
-        <w:t xml:space="preserve"> and has the </w:t>
-      </w:r>
-      <w:r>
-        <w:rPr>
-          <w:rFonts w:asciiTheme="minorHAnsi" w:hAnsiTheme="minorHAnsi" w:cstheme="minorHAnsi"/>
-          <w:sz w:val="22"/>
-          <w:szCs w:val="22"/>
-        </w:rPr>
-        <w:t>UTC+1</w:t>
-      </w:r>
-      <w:r>
-        <w:rPr>
-          <w:rFonts w:asciiTheme="minorHAnsi" w:hAnsiTheme="minorHAnsi" w:cstheme="minorHAnsi"/>
-          <w:sz w:val="22"/>
-          <w:szCs w:val="22"/>
-        </w:rPr>
-        <w:t xml:space="preserve"> time zone; but in summer France uses </w:t>
-      </w:r>
-      <w:r>
-        <w:rPr>
-          <w:rFonts w:asciiTheme="minorHAnsi" w:hAnsiTheme="minorHAnsi" w:cstheme="minorHAnsi"/>
-          <w:sz w:val="22"/>
-          <w:szCs w:val="22"/>
-        </w:rPr>
-        <w:t>Central European</w:t>
-      </w:r>
-      <w:r>
-        <w:rPr>
-          <w:rFonts w:asciiTheme="minorHAnsi" w:hAnsiTheme="minorHAnsi" w:cstheme="minorHAnsi"/>
-          <w:sz w:val="22"/>
-          <w:szCs w:val="22"/>
-        </w:rPr>
-        <w:t xml:space="preserve"> Summer</w:t>
-      </w:r>
-      <w:r>
-        <w:rPr>
-          <w:rFonts w:asciiTheme="minorHAnsi" w:hAnsiTheme="minorHAnsi" w:cstheme="minorHAnsi"/>
-          <w:sz w:val="22"/>
-          <w:szCs w:val="22"/>
-        </w:rPr>
-        <w:t xml:space="preserve"> Time</w:t>
-      </w:r>
-      <w:r>
-        <w:rPr>
-          <w:rFonts w:asciiTheme="minorHAnsi" w:hAnsiTheme="minorHAnsi" w:cstheme="minorHAnsi"/>
-          <w:sz w:val="22"/>
-          <w:szCs w:val="22"/>
-        </w:rPr>
-        <w:t xml:space="preserve"> and has the </w:t>
-      </w:r>
-      <w:r>
-        <w:rPr>
-          <w:rFonts w:asciiTheme="minorHAnsi" w:hAnsiTheme="minorHAnsi" w:cstheme="minorHAnsi"/>
-          <w:sz w:val="22"/>
-          <w:szCs w:val="22"/>
-        </w:rPr>
-        <w:t>UTC+</w:t>
-      </w:r>
-      <w:r>
-        <w:rPr>
-          <w:rFonts w:asciiTheme="minorHAnsi" w:hAnsiTheme="minorHAnsi" w:cstheme="minorHAnsi"/>
-          <w:sz w:val="22"/>
-          <w:szCs w:val="22"/>
-        </w:rPr>
-        <w:t>2 time zone.</w:t>
-      </w:r>
-    </w:p>
-    <w:p>
-      <w:pPr>
-        <w:rPr>
-          <w:rFonts w:asciiTheme="minorHAnsi" w:hAnsiTheme="minorHAnsi" w:cstheme="minorHAnsi"/>
-          <w:sz w:val="22"/>
-          <w:szCs w:val="22"/>
-        </w:rPr>
-      </w:pPr>
-      <w:r>
-        <w:rPr>
-          <w:rFonts w:asciiTheme="minorHAnsi" w:hAnsiTheme="minorHAnsi" w:cstheme="minorHAnsi"/>
-          <w:sz w:val="22"/>
-          <w:szCs w:val="22"/>
-        </w:rPr>
-        <w:t>So, i</w:t>
-      </w:r>
-      <w:r>
-        <w:rPr>
-          <w:rFonts w:asciiTheme="minorHAnsi" w:hAnsiTheme="minorHAnsi" w:cstheme="minorHAnsi"/>
-          <w:sz w:val="22"/>
-          <w:szCs w:val="22"/>
-        </w:rPr>
-        <w:t>f in the country of</w:t>
-      </w:r>
-      <w:r>
-        <w:rPr>
-          <w:rFonts w:asciiTheme="minorHAnsi" w:hAnsiTheme="minorHAnsi" w:cstheme="minorHAnsi"/>
-          <w:sz w:val="22"/>
-          <w:szCs w:val="22"/>
-        </w:rPr>
-        <w:t xml:space="preserve"> your</w:t>
-      </w:r>
-      <w:r>
-        <w:rPr>
-          <w:rFonts w:asciiTheme="minorHAnsi" w:hAnsiTheme="minorHAnsi" w:cstheme="minorHAnsi"/>
-          <w:sz w:val="22"/>
-          <w:szCs w:val="22"/>
-        </w:rPr>
-        <w:t xml:space="preserve"> campus location it is common to switch between winter time and summer time, </w:t>
-      </w:r>
-      <w:r>
-        <w:rPr>
-          <w:rFonts w:asciiTheme="minorHAnsi" w:hAnsiTheme="minorHAnsi" w:cstheme="minorHAnsi"/>
-          <w:sz w:val="22"/>
-          <w:szCs w:val="22"/>
-        </w:rPr>
-        <w:t xml:space="preserve">make sure to </w:t>
-      </w:r>
-      <w:r>
-        <w:rPr>
-          <w:rFonts w:asciiTheme="minorHAnsi" w:hAnsiTheme="minorHAnsi" w:cstheme="minorHAnsi"/>
-          <w:sz w:val="22"/>
-          <w:szCs w:val="22"/>
-        </w:rPr>
-        <w:t>use the WINTER</w:t>
-      </w:r>
-      <w:r>
-        <w:rPr>
-          <w:rFonts w:asciiTheme="minorHAnsi" w:hAnsiTheme="minorHAnsi" w:cstheme="minorHAnsi"/>
-          <w:sz w:val="22"/>
-          <w:szCs w:val="22"/>
-        </w:rPr>
-        <w:t>-</w:t>
-      </w:r>
-      <w:r>
-        <w:rPr>
-          <w:rFonts w:asciiTheme="minorHAnsi" w:hAnsiTheme="minorHAnsi" w:cstheme="minorHAnsi"/>
-          <w:sz w:val="22"/>
-          <w:szCs w:val="22"/>
-        </w:rPr>
-        <w:t xml:space="preserve">TIME </w:t>
-      </w:r>
-      <w:r>
-        <w:rPr>
-          <w:rFonts w:asciiTheme="minorHAnsi" w:hAnsiTheme="minorHAnsi" w:cstheme="minorHAnsi"/>
-          <w:sz w:val="22"/>
-          <w:szCs w:val="22"/>
-        </w:rPr>
-        <w:t>TIME ZONE</w:t>
-      </w:r>
-      <w:r>
-        <w:rPr>
-          <w:rFonts w:asciiTheme="minorHAnsi" w:hAnsiTheme="minorHAnsi" w:cstheme="minorHAnsi"/>
-          <w:sz w:val="22"/>
-          <w:szCs w:val="22"/>
-        </w:rPr>
-        <w:t xml:space="preserve"> in the macro. I</w:t>
-      </w:r>
-      <w:r>
-        <w:rPr>
-          <w:rFonts w:asciiTheme="minorHAnsi" w:hAnsiTheme="minorHAnsi" w:cstheme="minorHAnsi"/>
-          <w:sz w:val="22"/>
-          <w:szCs w:val="22"/>
-        </w:rPr>
-        <w:t>nclude "-" sign if it applies to the time zone of your cluster. Do not include "+" sign</w:t>
+        <w:t>is 1.</w:t>
+      </w:r>
+    </w:p>
+    <w:p>
+      <w:pPr>
+        <w:rPr>
+          <w:rFonts w:asciiTheme="minorHAnsi" w:hAnsiTheme="minorHAnsi" w:cstheme="minorHAnsi"/>
+          <w:sz w:val="22"/>
+          <w:szCs w:val="22"/>
+        </w:rPr>
+      </w:pPr>
+    </w:p>
+    <w:p>
+      <w:pPr>
+        <w:rPr>
+          <w:rFonts w:asciiTheme="minorHAnsi" w:hAnsiTheme="minorHAnsi" w:cstheme="minorHAnsi"/>
+          <w:sz w:val="22"/>
+          <w:szCs w:val="22"/>
+        </w:rPr>
+      </w:pPr>
+      <w:r>
+        <w:rPr>
+          <w:rFonts w:asciiTheme="minorHAnsi" w:hAnsiTheme="minorHAnsi" w:cstheme="minorHAnsi"/>
+          <w:sz w:val="22"/>
+          <w:szCs w:val="22"/>
+        </w:rPr>
+        <w:t>I</w:t>
+      </w:r>
+      <w:r>
+        <w:rPr>
+          <w:rFonts w:asciiTheme="minorHAnsi" w:hAnsiTheme="minorHAnsi" w:cstheme="minorHAnsi"/>
+          <w:sz w:val="22"/>
+          <w:szCs w:val="22"/>
+        </w:rPr>
+        <w:t xml:space="preserve">nclude "-" sign if it applies to the time zone of your </w:t>
+      </w:r>
+      <w:r>
+        <w:rPr>
+          <w:rFonts w:asciiTheme="minorHAnsi" w:hAnsiTheme="minorHAnsi" w:cstheme="minorHAnsi"/>
+          <w:sz w:val="22"/>
+          <w:szCs w:val="22"/>
+        </w:rPr>
+        <w:t>campus</w:t>
+      </w:r>
+      <w:r>
+        <w:rPr>
+          <w:rFonts w:asciiTheme="minorHAnsi" w:hAnsiTheme="minorHAnsi" w:cstheme="minorHAnsi"/>
+          <w:sz w:val="22"/>
+          <w:szCs w:val="22"/>
+        </w:rPr>
+        <w:t>. Do not include "+" sign</w:t>
       </w:r>
       <w:r>
         <w:rPr>
@@ -37031,6 +37316,119 @@
     </w:lvl>
   </w:abstractNum>
   <w:abstractNum w:abstractNumId="5" w15:restartNumberingAfterBreak="0">
+    <w:nsid w:val="083925E0"/>
+    <w:multiLevelType w:val="hybridMultilevel"/>
+    <w:tmpl w:val="7D5227FC"/>
+    <w:lvl w:ilvl="0" w:tplc="04050001">
+      <w:start w:val="1"/>
+      <w:numFmt w:val="bullet"/>
+      <w:lvlText w:val=""/>
+      <w:lvlJc w:val="left"/>
+      <w:pPr>
+        <w:ind w:left="720" w:hanging="360"/>
+      </w:pPr>
+      <w:rPr>
+        <w:rFonts w:ascii="Symbol" w:hAnsi="Symbol" w:hint="default"/>
+      </w:rPr>
+    </w:lvl>
+    <w:lvl w:ilvl="1" w:tplc="04050003" w:tentative="1">
+      <w:start w:val="1"/>
+      <w:numFmt w:val="bullet"/>
+      <w:lvlText w:val="o"/>
+      <w:lvlJc w:val="left"/>
+      <w:pPr>
+        <w:ind w:left="1440" w:hanging="360"/>
+      </w:pPr>
+      <w:rPr>
+        <w:rFonts w:ascii="Courier New" w:hAnsi="Courier New" w:cs="Courier New" w:hint="default"/>
+      </w:rPr>
+    </w:lvl>
+    <w:lvl w:ilvl="2" w:tplc="04050005" w:tentative="1">
+      <w:start w:val="1"/>
+      <w:numFmt w:val="bullet"/>
+      <w:lvlText w:val=""/>
+      <w:lvlJc w:val="left"/>
+      <w:pPr>
+        <w:ind w:left="2160" w:hanging="360"/>
+      </w:pPr>
+      <w:rPr>
+        <w:rFonts w:ascii="Wingdings" w:hAnsi="Wingdings" w:hint="default"/>
+      </w:rPr>
+    </w:lvl>
+    <w:lvl w:ilvl="3" w:tplc="04050001" w:tentative="1">
+      <w:start w:val="1"/>
+      <w:numFmt w:val="bullet"/>
+      <w:lvlText w:val=""/>
+      <w:lvlJc w:val="left"/>
+      <w:pPr>
+        <w:ind w:left="2880" w:hanging="360"/>
+      </w:pPr>
+      <w:rPr>
+        <w:rFonts w:ascii="Symbol" w:hAnsi="Symbol" w:hint="default"/>
+      </w:rPr>
+    </w:lvl>
+    <w:lvl w:ilvl="4" w:tplc="04050003" w:tentative="1">
+      <w:start w:val="1"/>
+      <w:numFmt w:val="bullet"/>
+      <w:lvlText w:val="o"/>
+      <w:lvlJc w:val="left"/>
+      <w:pPr>
+        <w:ind w:left="3600" w:hanging="360"/>
+      </w:pPr>
+      <w:rPr>
+        <w:rFonts w:ascii="Courier New" w:hAnsi="Courier New" w:cs="Courier New" w:hint="default"/>
+      </w:rPr>
+    </w:lvl>
+    <w:lvl w:ilvl="5" w:tplc="04050005" w:tentative="1">
+      <w:start w:val="1"/>
+      <w:numFmt w:val="bullet"/>
+      <w:lvlText w:val=""/>
+      <w:lvlJc w:val="left"/>
+      <w:pPr>
+        <w:ind w:left="4320" w:hanging="360"/>
+      </w:pPr>
+      <w:rPr>
+        <w:rFonts w:ascii="Wingdings" w:hAnsi="Wingdings" w:hint="default"/>
+      </w:rPr>
+    </w:lvl>
+    <w:lvl w:ilvl="6" w:tplc="04050001" w:tentative="1">
+      <w:start w:val="1"/>
+      <w:numFmt w:val="bullet"/>
+      <w:lvlText w:val=""/>
+      <w:lvlJc w:val="left"/>
+      <w:pPr>
+        <w:ind w:left="5040" w:hanging="360"/>
+      </w:pPr>
+      <w:rPr>
+        <w:rFonts w:ascii="Symbol" w:hAnsi="Symbol" w:hint="default"/>
+      </w:rPr>
+    </w:lvl>
+    <w:lvl w:ilvl="7" w:tplc="04050003" w:tentative="1">
+      <w:start w:val="1"/>
+      <w:numFmt w:val="bullet"/>
+      <w:lvlText w:val="o"/>
+      <w:lvlJc w:val="left"/>
+      <w:pPr>
+        <w:ind w:left="5760" w:hanging="360"/>
+      </w:pPr>
+      <w:rPr>
+        <w:rFonts w:ascii="Courier New" w:hAnsi="Courier New" w:cs="Courier New" w:hint="default"/>
+      </w:rPr>
+    </w:lvl>
+    <w:lvl w:ilvl="8" w:tplc="04050005" w:tentative="1">
+      <w:start w:val="1"/>
+      <w:numFmt w:val="bullet"/>
+      <w:lvlText w:val=""/>
+      <w:lvlJc w:val="left"/>
+      <w:pPr>
+        <w:ind w:left="6480" w:hanging="360"/>
+      </w:pPr>
+      <w:rPr>
+        <w:rFonts w:ascii="Wingdings" w:hAnsi="Wingdings" w:hint="default"/>
+      </w:rPr>
+    </w:lvl>
+  </w:abstractNum>
+  <w:abstractNum w:abstractNumId="6" w15:restartNumberingAfterBreak="0">
     <w:nsid w:val="0CD622DB"/>
     <w:multiLevelType w:val="hybridMultilevel"/>
     <w:tmpl w:val="32E29218"/>
@@ -37116,7 +37514,7 @@
       </w:pPr>
     </w:lvl>
   </w:abstractNum>
-  <w:abstractNum w:abstractNumId="6" w15:restartNumberingAfterBreak="0">
+  <w:abstractNum w:abstractNumId="7" w15:restartNumberingAfterBreak="0">
     <w:nsid w:val="0EA16FA2"/>
     <w:multiLevelType w:val="multilevel"/>
     <w:tmpl w:val="B6AEB90E"/>
@@ -37265,7 +37663,7 @@
       </w:rPr>
     </w:lvl>
   </w:abstractNum>
-  <w:abstractNum w:abstractNumId="7" w15:restartNumberingAfterBreak="0">
+  <w:abstractNum w:abstractNumId="8" w15:restartNumberingAfterBreak="0">
     <w:nsid w:val="1A7D7655"/>
     <w:multiLevelType w:val="hybridMultilevel"/>
     <w:tmpl w:val="F28A489A"/>
@@ -37351,7 +37749,7 @@
       </w:pPr>
     </w:lvl>
   </w:abstractNum>
-  <w:abstractNum w:abstractNumId="8" w15:restartNumberingAfterBreak="0">
+  <w:abstractNum w:abstractNumId="9" w15:restartNumberingAfterBreak="0">
     <w:nsid w:val="24121109"/>
     <w:multiLevelType w:val="hybridMultilevel"/>
     <w:tmpl w:val="7750C39C"/>
@@ -37464,7 +37862,7 @@
       </w:rPr>
     </w:lvl>
   </w:abstractNum>
-  <w:abstractNum w:abstractNumId="9" w15:restartNumberingAfterBreak="0">
+  <w:abstractNum w:abstractNumId="10" w15:restartNumberingAfterBreak="0">
     <w:nsid w:val="28590940"/>
     <w:multiLevelType w:val="multilevel"/>
     <w:tmpl w:val="09E2899E"/>
@@ -37613,7 +38011,7 @@
       </w:rPr>
     </w:lvl>
   </w:abstractNum>
-  <w:abstractNum w:abstractNumId="10" w15:restartNumberingAfterBreak="0">
+  <w:abstractNum w:abstractNumId="11" w15:restartNumberingAfterBreak="0">
     <w:nsid w:val="297537E8"/>
     <w:multiLevelType w:val="hybridMultilevel"/>
     <w:tmpl w:val="0A2EC628"/>
@@ -37699,7 +38097,7 @@
       </w:pPr>
     </w:lvl>
   </w:abstractNum>
-  <w:abstractNum w:abstractNumId="11" w15:restartNumberingAfterBreak="0">
+  <w:abstractNum w:abstractNumId="12" w15:restartNumberingAfterBreak="0">
     <w:nsid w:val="2C7E29CD"/>
     <w:multiLevelType w:val="hybridMultilevel"/>
     <w:tmpl w:val="CA28062C"/>
@@ -37812,7 +38210,7 @@
       </w:rPr>
     </w:lvl>
   </w:abstractNum>
-  <w:abstractNum w:abstractNumId="12" w15:restartNumberingAfterBreak="0">
+  <w:abstractNum w:abstractNumId="13" w15:restartNumberingAfterBreak="0">
     <w:nsid w:val="2CFF69D2"/>
     <w:multiLevelType w:val="hybridMultilevel"/>
     <w:tmpl w:val="D37AA3C6"/>
@@ -37925,7 +38323,7 @@
       </w:rPr>
     </w:lvl>
   </w:abstractNum>
-  <w:abstractNum w:abstractNumId="13" w15:restartNumberingAfterBreak="0">
+  <w:abstractNum w:abstractNumId="14" w15:restartNumberingAfterBreak="0">
     <w:nsid w:val="2D06733D"/>
     <w:multiLevelType w:val="hybridMultilevel"/>
     <w:tmpl w:val="8166A1EA"/>
@@ -38038,7 +38436,7 @@
       </w:rPr>
     </w:lvl>
   </w:abstractNum>
-  <w:abstractNum w:abstractNumId="14" w15:restartNumberingAfterBreak="0">
+  <w:abstractNum w:abstractNumId="15" w15:restartNumberingAfterBreak="0">
     <w:nsid w:val="34E87150"/>
     <w:multiLevelType w:val="hybridMultilevel"/>
     <w:tmpl w:val="D74ADAF2"/>
@@ -38151,7 +38549,7 @@
       </w:rPr>
     </w:lvl>
   </w:abstractNum>
-  <w:abstractNum w:abstractNumId="15" w15:restartNumberingAfterBreak="0">
+  <w:abstractNum w:abstractNumId="16" w15:restartNumberingAfterBreak="0">
     <w:nsid w:val="3CE54F21"/>
     <w:multiLevelType w:val="multilevel"/>
     <w:tmpl w:val="BCE8C408"/>
@@ -38300,7 +38698,7 @@
       </w:rPr>
     </w:lvl>
   </w:abstractNum>
-  <w:abstractNum w:abstractNumId="16" w15:restartNumberingAfterBreak="0">
+  <w:abstractNum w:abstractNumId="17" w15:restartNumberingAfterBreak="0">
     <w:nsid w:val="41F34DFB"/>
     <w:multiLevelType w:val="hybridMultilevel"/>
     <w:tmpl w:val="A8069B38"/>
@@ -38413,7 +38811,7 @@
       </w:rPr>
     </w:lvl>
   </w:abstractNum>
-  <w:abstractNum w:abstractNumId="17" w15:restartNumberingAfterBreak="0">
+  <w:abstractNum w:abstractNumId="18" w15:restartNumberingAfterBreak="0">
     <w:nsid w:val="41FD382B"/>
     <w:multiLevelType w:val="hybridMultilevel"/>
     <w:tmpl w:val="F0FEE386"/>
@@ -38470,7 +38868,7 @@
       <w:lvlJc w:val="left"/>
     </w:lvl>
   </w:abstractNum>
-  <w:abstractNum w:abstractNumId="18" w15:restartNumberingAfterBreak="0">
+  <w:abstractNum w:abstractNumId="19" w15:restartNumberingAfterBreak="0">
     <w:nsid w:val="4A30674C"/>
     <w:multiLevelType w:val="hybridMultilevel"/>
     <w:tmpl w:val="137280CC"/>
@@ -38583,7 +38981,7 @@
       </w:rPr>
     </w:lvl>
   </w:abstractNum>
-  <w:abstractNum w:abstractNumId="19" w15:restartNumberingAfterBreak="0">
+  <w:abstractNum w:abstractNumId="20" w15:restartNumberingAfterBreak="0">
     <w:nsid w:val="4B0E0E91"/>
     <w:multiLevelType w:val="hybridMultilevel"/>
     <w:tmpl w:val="24A8A23E"/>
@@ -38640,7 +39038,7 @@
       <w:lvlJc w:val="left"/>
     </w:lvl>
   </w:abstractNum>
-  <w:abstractNum w:abstractNumId="20" w15:restartNumberingAfterBreak="0">
+  <w:abstractNum w:abstractNumId="21" w15:restartNumberingAfterBreak="0">
     <w:nsid w:val="4C4A79BB"/>
     <w:multiLevelType w:val="hybridMultilevel"/>
     <w:tmpl w:val="9B384550"/>
@@ -38752,7 +39150,7 @@
       </w:rPr>
     </w:lvl>
   </w:abstractNum>
-  <w:abstractNum w:abstractNumId="21" w15:restartNumberingAfterBreak="0">
+  <w:abstractNum w:abstractNumId="22" w15:restartNumberingAfterBreak="0">
     <w:nsid w:val="4F037789"/>
     <w:multiLevelType w:val="hybridMultilevel"/>
     <w:tmpl w:val="211ECC7C"/>
@@ -38865,7 +39263,7 @@
       </w:rPr>
     </w:lvl>
   </w:abstractNum>
-  <w:abstractNum w:abstractNumId="22" w15:restartNumberingAfterBreak="0">
+  <w:abstractNum w:abstractNumId="23" w15:restartNumberingAfterBreak="0">
     <w:nsid w:val="51450793"/>
     <w:multiLevelType w:val="hybridMultilevel"/>
     <w:tmpl w:val="BF384AD8"/>
@@ -38978,7 +39376,7 @@
       </w:rPr>
     </w:lvl>
   </w:abstractNum>
-  <w:abstractNum w:abstractNumId="23" w15:restartNumberingAfterBreak="0">
+  <w:abstractNum w:abstractNumId="24" w15:restartNumberingAfterBreak="0">
     <w:nsid w:val="551C5E3D"/>
     <w:multiLevelType w:val="hybridMultilevel"/>
     <w:tmpl w:val="EAA0B596"/>
@@ -39091,7 +39489,7 @@
       </w:rPr>
     </w:lvl>
   </w:abstractNum>
-  <w:abstractNum w:abstractNumId="24" w15:restartNumberingAfterBreak="0">
+  <w:abstractNum w:abstractNumId="25" w15:restartNumberingAfterBreak="0">
     <w:nsid w:val="57C97CC2"/>
     <w:multiLevelType w:val="hybridMultilevel"/>
     <w:tmpl w:val="EC44B476"/>
@@ -39148,7 +39546,7 @@
       <w:lvlJc w:val="left"/>
     </w:lvl>
   </w:abstractNum>
-  <w:abstractNum w:abstractNumId="25" w15:restartNumberingAfterBreak="0">
+  <w:abstractNum w:abstractNumId="26" w15:restartNumberingAfterBreak="0">
     <w:nsid w:val="59CE7406"/>
     <w:multiLevelType w:val="hybridMultilevel"/>
     <w:tmpl w:val="93D282B6"/>
@@ -39261,7 +39659,7 @@
       </w:rPr>
     </w:lvl>
   </w:abstractNum>
-  <w:abstractNum w:abstractNumId="26" w15:restartNumberingAfterBreak="0">
+  <w:abstractNum w:abstractNumId="27" w15:restartNumberingAfterBreak="0">
     <w:nsid w:val="5A025382"/>
     <w:multiLevelType w:val="hybridMultilevel"/>
     <w:tmpl w:val="CBB2267A"/>
@@ -39347,7 +39745,7 @@
       </w:pPr>
     </w:lvl>
   </w:abstractNum>
-  <w:abstractNum w:abstractNumId="27" w15:restartNumberingAfterBreak="0">
+  <w:abstractNum w:abstractNumId="28" w15:restartNumberingAfterBreak="0">
     <w:nsid w:val="5C46207E"/>
     <w:multiLevelType w:val="multilevel"/>
     <w:tmpl w:val="C81A4712"/>
@@ -39464,7 +39862,7 @@
       </w:pPr>
     </w:lvl>
   </w:abstractNum>
-  <w:abstractNum w:abstractNumId="28" w15:restartNumberingAfterBreak="0">
+  <w:abstractNum w:abstractNumId="29" w15:restartNumberingAfterBreak="0">
     <w:nsid w:val="5CD10B6B"/>
     <w:multiLevelType w:val="hybridMultilevel"/>
     <w:tmpl w:val="8B9EBA02"/>
@@ -39577,7 +39975,7 @@
       </w:rPr>
     </w:lvl>
   </w:abstractNum>
-  <w:abstractNum w:abstractNumId="29" w15:restartNumberingAfterBreak="0">
+  <w:abstractNum w:abstractNumId="30" w15:restartNumberingAfterBreak="0">
     <w:nsid w:val="5CEC051D"/>
     <w:multiLevelType w:val="hybridMultilevel"/>
     <w:tmpl w:val="488803E6"/>
@@ -39690,7 +40088,7 @@
       </w:rPr>
     </w:lvl>
   </w:abstractNum>
-  <w:abstractNum w:abstractNumId="30" w15:restartNumberingAfterBreak="0">
+  <w:abstractNum w:abstractNumId="31" w15:restartNumberingAfterBreak="0">
     <w:nsid w:val="61233B82"/>
     <w:multiLevelType w:val="multilevel"/>
     <w:tmpl w:val="31DE78F6"/>
@@ -39839,7 +40237,7 @@
       </w:rPr>
     </w:lvl>
   </w:abstractNum>
-  <w:abstractNum w:abstractNumId="31" w15:restartNumberingAfterBreak="0">
+  <w:abstractNum w:abstractNumId="32" w15:restartNumberingAfterBreak="0">
     <w:nsid w:val="62E40816"/>
     <w:multiLevelType w:val="multilevel"/>
     <w:tmpl w:val="E8AA45C0"/>
@@ -39988,7 +40386,7 @@
       </w:rPr>
     </w:lvl>
   </w:abstractNum>
-  <w:abstractNum w:abstractNumId="32" w15:restartNumberingAfterBreak="0">
+  <w:abstractNum w:abstractNumId="33" w15:restartNumberingAfterBreak="0">
     <w:nsid w:val="66BB6FFE"/>
     <w:multiLevelType w:val="hybridMultilevel"/>
     <w:tmpl w:val="80BAD8FE"/>
@@ -40101,7 +40499,7 @@
       </w:rPr>
     </w:lvl>
   </w:abstractNum>
-  <w:abstractNum w:abstractNumId="33" w15:restartNumberingAfterBreak="0">
+  <w:abstractNum w:abstractNumId="34" w15:restartNumberingAfterBreak="0">
     <w:nsid w:val="6DA36584"/>
     <w:multiLevelType w:val="multilevel"/>
     <w:tmpl w:val="AD10EA44"/>
@@ -40250,7 +40648,7 @@
       </w:rPr>
     </w:lvl>
   </w:abstractNum>
-  <w:abstractNum w:abstractNumId="34" w15:restartNumberingAfterBreak="0">
+  <w:abstractNum w:abstractNumId="35" w15:restartNumberingAfterBreak="0">
     <w:nsid w:val="6E6F5B9A"/>
     <w:multiLevelType w:val="hybridMultilevel"/>
     <w:tmpl w:val="8558E2F2"/>
@@ -40336,7 +40734,7 @@
       </w:pPr>
     </w:lvl>
   </w:abstractNum>
-  <w:abstractNum w:abstractNumId="35" w15:restartNumberingAfterBreak="0">
+  <w:abstractNum w:abstractNumId="36" w15:restartNumberingAfterBreak="0">
     <w:nsid w:val="6FBA030F"/>
     <w:multiLevelType w:val="multilevel"/>
     <w:tmpl w:val="F78EC19A"/>
@@ -40485,7 +40883,7 @@
       </w:rPr>
     </w:lvl>
   </w:abstractNum>
-  <w:abstractNum w:abstractNumId="36" w15:restartNumberingAfterBreak="0">
+  <w:abstractNum w:abstractNumId="37" w15:restartNumberingAfterBreak="0">
     <w:nsid w:val="71D00C76"/>
     <w:multiLevelType w:val="hybridMultilevel"/>
     <w:tmpl w:val="6A02403E"/>
@@ -40571,7 +40969,7 @@
       </w:pPr>
     </w:lvl>
   </w:abstractNum>
-  <w:abstractNum w:abstractNumId="37" w15:restartNumberingAfterBreak="0">
+  <w:abstractNum w:abstractNumId="38" w15:restartNumberingAfterBreak="0">
     <w:nsid w:val="744E210B"/>
     <w:multiLevelType w:val="hybridMultilevel"/>
     <w:tmpl w:val="9822F04E"/>
@@ -40684,7 +41082,7 @@
       </w:rPr>
     </w:lvl>
   </w:abstractNum>
-  <w:abstractNum w:abstractNumId="38" w15:restartNumberingAfterBreak="0">
+  <w:abstractNum w:abstractNumId="39" w15:restartNumberingAfterBreak="0">
     <w:nsid w:val="7492688A"/>
     <w:multiLevelType w:val="hybridMultilevel"/>
     <w:tmpl w:val="32E29218"/>
@@ -40770,7 +41168,7 @@
       </w:pPr>
     </w:lvl>
   </w:abstractNum>
-  <w:abstractNum w:abstractNumId="39" w15:restartNumberingAfterBreak="0">
+  <w:abstractNum w:abstractNumId="40" w15:restartNumberingAfterBreak="0">
     <w:nsid w:val="761C686D"/>
     <w:multiLevelType w:val="hybridMultilevel"/>
     <w:tmpl w:val="DEB45C4E"/>
@@ -40883,7 +41281,7 @@
       </w:rPr>
     </w:lvl>
   </w:abstractNum>
-  <w:abstractNum w:abstractNumId="40" w15:restartNumberingAfterBreak="0">
+  <w:abstractNum w:abstractNumId="41" w15:restartNumberingAfterBreak="0">
     <w:nsid w:val="79D7047F"/>
     <w:multiLevelType w:val="hybridMultilevel"/>
     <w:tmpl w:val="3F4242CE"/>
@@ -40996,7 +41394,7 @@
       </w:rPr>
     </w:lvl>
   </w:abstractNum>
-  <w:abstractNum w:abstractNumId="41" w15:restartNumberingAfterBreak="0">
+  <w:abstractNum w:abstractNumId="42" w15:restartNumberingAfterBreak="0">
     <w:nsid w:val="7BC050BD"/>
     <w:multiLevelType w:val="hybridMultilevel"/>
     <w:tmpl w:val="E5847778"/>
@@ -41085,7 +41483,7 @@
       </w:pPr>
     </w:lvl>
   </w:abstractNum>
-  <w:abstractNum w:abstractNumId="42" w15:restartNumberingAfterBreak="0">
+  <w:abstractNum w:abstractNumId="43" w15:restartNumberingAfterBreak="0">
     <w:nsid w:val="7DE873E7"/>
     <w:multiLevelType w:val="multilevel"/>
     <w:tmpl w:val="4DEE3816"/>
@@ -41235,121 +41633,121 @@
     </w:lvl>
   </w:abstractNum>
   <w:num w:numId="1" w16cid:durableId="1447388602">
-    <w:abstractNumId w:val="21"/>
+    <w:abstractNumId w:val="22"/>
   </w:num>
   <w:num w:numId="2" w16cid:durableId="1948003538">
-    <w:abstractNumId w:val="23"/>
+    <w:abstractNumId w:val="24"/>
   </w:num>
   <w:num w:numId="3" w16cid:durableId="428352006">
     <w:abstractNumId w:val="1"/>
   </w:num>
   <w:num w:numId="4" w16cid:durableId="115608642">
-    <w:abstractNumId w:val="19"/>
+    <w:abstractNumId w:val="20"/>
   </w:num>
   <w:num w:numId="5" w16cid:durableId="1677532577">
-    <w:abstractNumId w:val="24"/>
+    <w:abstractNumId w:val="25"/>
   </w:num>
   <w:num w:numId="6" w16cid:durableId="718627731">
-    <w:abstractNumId w:val="17"/>
+    <w:abstractNumId w:val="18"/>
   </w:num>
   <w:num w:numId="7" w16cid:durableId="1887910498">
-    <w:abstractNumId w:val="32"/>
+    <w:abstractNumId w:val="33"/>
   </w:num>
   <w:num w:numId="8" w16cid:durableId="1004012833">
     <w:abstractNumId w:val="2"/>
   </w:num>
   <w:num w:numId="9" w16cid:durableId="1057817824">
-    <w:abstractNumId w:val="39"/>
+    <w:abstractNumId w:val="40"/>
   </w:num>
   <w:num w:numId="10" w16cid:durableId="1256748402">
-    <w:abstractNumId w:val="40"/>
+    <w:abstractNumId w:val="41"/>
   </w:num>
   <w:num w:numId="11" w16cid:durableId="1252663841">
-    <w:abstractNumId w:val="13"/>
+    <w:abstractNumId w:val="14"/>
   </w:num>
   <w:num w:numId="12" w16cid:durableId="2081555796">
-    <w:abstractNumId w:val="14"/>
+    <w:abstractNumId w:val="15"/>
   </w:num>
   <w:num w:numId="13" w16cid:durableId="685401924">
     <w:abstractNumId w:val="3"/>
   </w:num>
   <w:num w:numId="14" w16cid:durableId="831411404">
+    <w:abstractNumId w:val="27"/>
+  </w:num>
+  <w:num w:numId="15" w16cid:durableId="872697447">
+    <w:abstractNumId w:val="39"/>
+  </w:num>
+  <w:num w:numId="16" w16cid:durableId="1126117956">
+    <w:abstractNumId w:val="17"/>
+  </w:num>
+  <w:num w:numId="17" w16cid:durableId="941108632">
+    <w:abstractNumId w:val="16"/>
+  </w:num>
+  <w:num w:numId="18" w16cid:durableId="319626160">
+    <w:abstractNumId w:val="34"/>
+  </w:num>
+  <w:num w:numId="19" w16cid:durableId="2119058599">
+    <w:abstractNumId w:val="36"/>
+  </w:num>
+  <w:num w:numId="20" w16cid:durableId="690958598">
+    <w:abstractNumId w:val="31"/>
+  </w:num>
+  <w:num w:numId="21" w16cid:durableId="1869292214">
+    <w:abstractNumId w:val="43"/>
+  </w:num>
+  <w:num w:numId="22" w16cid:durableId="1617977992">
+    <w:abstractNumId w:val="7"/>
+  </w:num>
+  <w:num w:numId="23" w16cid:durableId="607271204">
+    <w:abstractNumId w:val="32"/>
+  </w:num>
+  <w:num w:numId="24" w16cid:durableId="502739204">
+    <w:abstractNumId w:val="10"/>
+  </w:num>
+  <w:num w:numId="25" w16cid:durableId="230162898">
+    <w:abstractNumId w:val="30"/>
+  </w:num>
+  <w:num w:numId="26" w16cid:durableId="593592183">
+    <w:abstractNumId w:val="9"/>
+  </w:num>
+  <w:num w:numId="27" w16cid:durableId="817652340">
+    <w:abstractNumId w:val="28"/>
+  </w:num>
+  <w:num w:numId="28" w16cid:durableId="382873453">
+    <w:abstractNumId w:val="6"/>
+  </w:num>
+  <w:num w:numId="29" w16cid:durableId="1691908137">
     <w:abstractNumId w:val="26"/>
   </w:num>
-  <w:num w:numId="15" w16cid:durableId="872697447">
+  <w:num w:numId="30" w16cid:durableId="1720283053">
+    <w:abstractNumId w:val="37"/>
+  </w:num>
+  <w:num w:numId="31" w16cid:durableId="1934974298">
+    <w:abstractNumId w:val="42"/>
+  </w:num>
+  <w:num w:numId="32" w16cid:durableId="982848507">
+    <w:abstractNumId w:val="19"/>
+  </w:num>
+  <w:num w:numId="33" w16cid:durableId="1285967301">
+    <w:abstractNumId w:val="23"/>
+  </w:num>
+  <w:num w:numId="34" w16cid:durableId="2054188682">
     <w:abstractNumId w:val="38"/>
   </w:num>
-  <w:num w:numId="16" w16cid:durableId="1126117956">
-    <w:abstractNumId w:val="16"/>
+  <w:num w:numId="35" w16cid:durableId="105199470">
+    <w:abstractNumId w:val="8"/>
   </w:num>
-  <w:num w:numId="17" w16cid:durableId="941108632">
-    <w:abstractNumId w:val="15"/>
-  </w:num>
-  <w:num w:numId="18" w16cid:durableId="319626160">
-    <w:abstractNumId w:val="33"/>
-  </w:num>
-  <w:num w:numId="19" w16cid:durableId="2119058599">
-    <w:abstractNumId w:val="35"/>
-  </w:num>
-  <w:num w:numId="20" w16cid:durableId="690958598">
-    <w:abstractNumId w:val="30"/>
-  </w:num>
-  <w:num w:numId="21" w16cid:durableId="1869292214">
-    <w:abstractNumId w:val="42"/>
-  </w:num>
-  <w:num w:numId="22" w16cid:durableId="1617977992">
-    <w:abstractNumId w:val="6"/>
-  </w:num>
-  <w:num w:numId="23" w16cid:durableId="607271204">
-    <w:abstractNumId w:val="31"/>
-  </w:num>
-  <w:num w:numId="24" w16cid:durableId="502739204">
-    <w:abstractNumId w:val="9"/>
-  </w:num>
-  <w:num w:numId="25" w16cid:durableId="230162898">
+  <w:num w:numId="36" w16cid:durableId="98720103">
     <w:abstractNumId w:val="29"/>
   </w:num>
-  <w:num w:numId="26" w16cid:durableId="593592183">
-    <w:abstractNumId w:val="8"/>
+  <w:num w:numId="37" w16cid:durableId="1554658429">
+    <w:abstractNumId w:val="13"/>
   </w:num>
-  <w:num w:numId="27" w16cid:durableId="817652340">
-    <w:abstractNumId w:val="27"/>
-  </w:num>
-  <w:num w:numId="28" w16cid:durableId="382873453">
-    <w:abstractNumId w:val="5"/>
-  </w:num>
-  <w:num w:numId="29" w16cid:durableId="1691908137">
-    <w:abstractNumId w:val="25"/>
-  </w:num>
-  <w:num w:numId="30" w16cid:durableId="1720283053">
-    <w:abstractNumId w:val="36"/>
-  </w:num>
-  <w:num w:numId="31" w16cid:durableId="1934974298">
-    <w:abstractNumId w:val="41"/>
-  </w:num>
-  <w:num w:numId="32" w16cid:durableId="982848507">
-    <w:abstractNumId w:val="18"/>
-  </w:num>
-  <w:num w:numId="33" w16cid:durableId="1285967301">
-    <w:abstractNumId w:val="22"/>
-  </w:num>
-  <w:num w:numId="34" w16cid:durableId="2054188682">
-    <w:abstractNumId w:val="37"/>
-  </w:num>
-  <w:num w:numId="35" w16cid:durableId="105199470">
-    <w:abstractNumId w:val="7"/>
-  </w:num>
-  <w:num w:numId="36" w16cid:durableId="98720103">
-    <w:abstractNumId w:val="28"/>
-  </w:num>
-  <w:num w:numId="37" w16cid:durableId="1554658429">
+  <w:num w:numId="38" w16cid:durableId="2073500007">
     <w:abstractNumId w:val="12"/>
   </w:num>
-  <w:num w:numId="38" w16cid:durableId="2073500007">
-    <w:abstractNumId w:val="11"/>
-  </w:num>
   <w:num w:numId="39" w16cid:durableId="1341355599">
-    <w:abstractNumId w:val="20"/>
+    <w:abstractNumId w:val="21"/>
   </w:num>
   <w:num w:numId="40" w16cid:durableId="1198540684">
     <w:abstractNumId w:val="0"/>
@@ -41358,10 +41756,13 @@
     <w:abstractNumId w:val="4"/>
   </w:num>
   <w:num w:numId="42" w16cid:durableId="1691177080">
-    <w:abstractNumId w:val="34"/>
+    <w:abstractNumId w:val="35"/>
   </w:num>
   <w:num w:numId="43" w16cid:durableId="142091735">
-    <w:abstractNumId w:val="10"/>
+    <w:abstractNumId w:val="11"/>
+  </w:num>
+  <w:num w:numId="44" w16cid:durableId="1258635845">
+    <w:abstractNumId w:val="5"/>
   </w:num>
   <w:numIdMacAtCleanup w:val="26"/>
 </w:numbering>
@@ -43139,15 +43540,6 @@
 </file>
 
 <file path=customXml/item1.xml><?xml version="1.0" encoding="utf-8"?>
-<?mso-contentType ?>
-<FormTemplates xmlns="http://schemas.microsoft.com/sharepoint/v3/contenttype/forms">
-  <Display>DocumentLibraryForm</Display>
-  <Edit>AssetEditForm</Edit>
-  <New>DocumentLibraryForm</New>
-</FormTemplates>
-</file>
-
-<file path=customXml/item2.xml><?xml version="1.0" encoding="utf-8"?>
 <p:properties xmlns:p="http://schemas.microsoft.com/office/2006/metadata/properties" xmlns:xsi="http://www.w3.org/2001/XMLSchema-instance" xmlns:pc="http://schemas.microsoft.com/office/infopath/2007/PartnerControls">
   <documentManagement>
     <TPExecutable xmlns="4eb71313-1cf6-4961-b6ce-0c29fc5284b9" xsi:nil="true"/>
@@ -43274,11 +43666,16 @@
 </p:properties>
 </file>
 
-<file path=customXml/item3.xml><?xml version="1.0" encoding="utf-8"?>
-<b:Sources xmlns:b="http://schemas.openxmlformats.org/officeDocument/2006/bibliography" xmlns="http://schemas.openxmlformats.org/officeDocument/2006/bibliography" SelectedStyle="/APASixthEditionOfficeOnline.xsl" StyleName="APA" Version="6"/>
+<file path=customXml/item2.xml><?xml version="1.0" encoding="utf-8"?>
+<?mso-contentType ?>
+<FormTemplates xmlns="http://schemas.microsoft.com/sharepoint/v3/contenttype/forms">
+  <Display>DocumentLibraryForm</Display>
+  <Edit>AssetEditForm</Edit>
+  <New>DocumentLibraryForm</New>
+</FormTemplates>
 </file>
 
-<file path=customXml/item4.xml><?xml version="1.0" encoding="utf-8"?>
+<file path=customXml/item3.xml><?xml version="1.0" encoding="utf-8"?>
 <ct:contentTypeSchema xmlns:ct="http://schemas.microsoft.com/office/2006/metadata/contentType" xmlns:ma="http://schemas.microsoft.com/office/2006/metadata/properties/metaAttributes" ct:_="" ma:_="" ma:contentTypeName="TemplateFile" ma:contentTypeID="0x010100AC6DD24B17643A43B5911557F59D23340400899CD97D2199F748BA22A48D93649A64" ma:contentTypeVersion="58" ma:contentTypeDescription="Create a new document." ma:contentTypeScope="" ma:versionID="cb85242d804791fa63a999220e43a0bf">
   <xsd:schema xmlns:xsd="http://www.w3.org/2001/XMLSchema" xmlns:xs="http://www.w3.org/2001/XMLSchema" xmlns:p="http://schemas.microsoft.com/office/2006/metadata/properties" xmlns:ns2="4eb71313-1cf6-4961-b6ce-0c29fc5284b9" targetNamespace="http://schemas.microsoft.com/office/2006/metadata/properties" ma:root="true" ma:fieldsID="2e13631c6b34a2889e7ce7c8f1efd12b" ns2:_="">
     <xsd:import namespace="4eb71313-1cf6-4961-b6ce-0c29fc5284b9"/>
@@ -44312,15 +44709,11 @@
 </ct:contentTypeSchema>
 </file>
 
-<file path=customXml/itemProps1.xml><?xml version="1.0" encoding="utf-8"?>
-<ds:datastoreItem xmlns:ds="http://schemas.openxmlformats.org/officeDocument/2006/customXml" ds:itemID="{42AF3EE1-17D6-4994-8D19-1C5A21673D61}">
-  <ds:schemaRefs>
-    <ds:schemaRef ds:uri="http://schemas.microsoft.com/sharepoint/v3/contenttype/forms"/>
-  </ds:schemaRefs>
-</ds:datastoreItem>
+<file path=customXml/item4.xml><?xml version="1.0" encoding="utf-8"?>
+<b:Sources xmlns:b="http://schemas.openxmlformats.org/officeDocument/2006/bibliography" xmlns="http://schemas.openxmlformats.org/officeDocument/2006/bibliography" SelectedStyle="/APASixthEditionOfficeOnline.xsl" StyleName="APA" Version="6"/>
 </file>
 
-<file path=customXml/itemProps2.xml><?xml version="1.0" encoding="utf-8"?>
+<file path=customXml/itemProps1.xml><?xml version="1.0" encoding="utf-8"?>
 <ds:datastoreItem xmlns:ds="http://schemas.openxmlformats.org/officeDocument/2006/customXml" ds:itemID="{63E3A13E-B3BC-4A1C-88E3-0C4AF2AB6AEE}">
   <ds:schemaRefs>
     <ds:schemaRef ds:uri="http://schemas.microsoft.com/office/2006/metadata/properties"/>
@@ -44330,15 +44723,15 @@
 </ds:datastoreItem>
 </file>
 
-<file path=customXml/itemProps3.xml><?xml version="1.0" encoding="utf-8"?>
-<ds:datastoreItem xmlns:ds="http://schemas.openxmlformats.org/officeDocument/2006/customXml" ds:itemID="{A9C8C408-4E5E-524B-A672-45D328F6189D}">
+<file path=customXml/itemProps2.xml><?xml version="1.0" encoding="utf-8"?>
+<ds:datastoreItem xmlns:ds="http://schemas.openxmlformats.org/officeDocument/2006/customXml" ds:itemID="{42AF3EE1-17D6-4994-8D19-1C5A21673D61}">
   <ds:schemaRefs>
-    <ds:schemaRef ds:uri="http://schemas.openxmlformats.org/officeDocument/2006/bibliography"/>
+    <ds:schemaRef ds:uri="http://schemas.microsoft.com/sharepoint/v3/contenttype/forms"/>
   </ds:schemaRefs>
 </ds:datastoreItem>
 </file>
 
-<file path=customXml/itemProps4.xml><?xml version="1.0" encoding="utf-8"?>
+<file path=customXml/itemProps3.xml><?xml version="1.0" encoding="utf-8"?>
 <ds:datastoreItem xmlns:ds="http://schemas.openxmlformats.org/officeDocument/2006/customXml" ds:itemID="{3D5BC34A-A158-4DE6-9D48-EADCE6F2EC60}">
   <ds:schemaRefs>
     <ds:schemaRef ds:uri="http://schemas.microsoft.com/office/2006/metadata/contentType"/>
@@ -44354,4 +44747,12 @@
     <ds:schemaRef ds:uri="http://schemas.microsoft.com/internal/obd"/>
   </ds:schemaRefs>
 </ds:datastoreItem>
+</file>
+
+<file path=customXml/itemProps4.xml><?xml version="1.0" encoding="utf-8"?>
+<ds:datastoreItem xmlns:ds="http://schemas.openxmlformats.org/officeDocument/2006/customXml" ds:itemID="{A9C8C408-4E5E-524B-A672-45D328F6189D}">
+  <ds:schemaRefs>
+    <ds:schemaRef ds:uri="http://schemas.openxmlformats.org/officeDocument/2006/bibliography"/>
+  </ds:schemaRefs>
+</ds:datastoreItem>
 </file>
</xml_diff>

<commit_message>
remove dependency on time.h by refactoring unix_timestamp_decoder function
</commit_message>
<xml_diff>
--- a/docs/Technical Documentation.docx
+++ b/docs/Technical Documentation.docx
@@ -24807,19 +24807,7 @@
         <w:rPr>
           <w:rFonts w:cstheme="minorHAnsi"/>
         </w:rPr>
-        <w:t xml:space="preserve">last Sunday of March </w:t>
-      </w:r>
-      <w:r>
-        <w:rPr>
-          <w:rFonts w:cstheme="minorHAnsi"/>
-        </w:rPr>
-        <w:t>—</w:t>
-      </w:r>
-      <w:r>
-        <w:rPr>
-          <w:rFonts w:cstheme="minorHAnsi"/>
-        </w:rPr>
-        <w:t xml:space="preserve"> switch to summer time</w:t>
+        <w:t>last Sunday of March — switch to summer time</w:t>
       </w:r>
       <w:r>
         <w:rPr>
@@ -24843,19 +24831,7 @@
         <w:rPr>
           <w:rFonts w:cstheme="minorHAnsi"/>
         </w:rPr>
-        <w:t xml:space="preserve">last Sunday of October </w:t>
-      </w:r>
-      <w:r>
-        <w:rPr>
-          <w:rFonts w:cstheme="minorHAnsi"/>
-        </w:rPr>
-        <w:t xml:space="preserve">— </w:t>
-      </w:r>
-      <w:r>
-        <w:rPr>
-          <w:rFonts w:cstheme="minorHAnsi"/>
-        </w:rPr>
-        <w:t>switch back to winter time</w:t>
+        <w:t>last Sunday of October — switch back to winter time</w:t>
       </w:r>
       <w:r>
         <w:rPr>
@@ -25179,15 +25155,7 @@
           <w:sz w:val="22"/>
           <w:szCs w:val="22"/>
         </w:rPr>
-        <w:t xml:space="preserve"> </w:t>
-      </w:r>
-      <w:r>
-        <w:rPr>
-          <w:rFonts w:asciiTheme="minorHAnsi" w:hAnsiTheme="minorHAnsi" w:cstheme="minorHAnsi"/>
-          <w:sz w:val="22"/>
-          <w:szCs w:val="22"/>
-        </w:rPr>
-        <w:t>is 1.</w:t>
+        <w:t xml:space="preserve"> is 1.</w:t>
       </w:r>
     </w:p>
     <w:p>
@@ -30721,115 +30689,6 @@
                 <w:szCs w:val="22"/>
               </w:rPr>
               <w:t>dependency for the ArduinoOTA library</w:t>
-            </w:r>
-          </w:p>
-        </w:tc>
-      </w:tr>
-      <w:tr>
-        <w:trPr>
-          <w:trHeight w:val="397"/>
-        </w:trPr>
-        <w:tc>
-          <w:tcPr>
-            <w:tcW w:w="3970" w:type="dxa"/>
-            <w:tcMar>
-              <w:top w:w="100" w:type="nil"/>
-              <w:left w:w="20" w:type="nil"/>
-              <w:bottom w:w="20" w:type="nil"/>
-              <w:right w:w="100" w:type="nil"/>
-            </w:tcMar>
-            <w:vAlign w:val="center"/>
-          </w:tcPr>
-          <w:p>
-            <w:pPr>
-              <w:autoSpaceDE w:val="0"/>
-              <w:autoSpaceDN w:val="0"/>
-              <w:adjustRightInd w:val="0"/>
-              <w:rPr>
-                <w:rFonts w:asciiTheme="minorHAnsi" w:hAnsiTheme="minorHAnsi" w:cstheme="minorHAnsi"/>
-                <w:sz w:val="22"/>
-                <w:szCs w:val="22"/>
-              </w:rPr>
-            </w:pPr>
-            <w:r>
-              <w:rPr>
-                <w:rFonts w:asciiTheme="minorHAnsi" w:hAnsiTheme="minorHAnsi" w:cstheme="minorHAnsi"/>
-                <w:b/>
-                <w:bCs/>
-                <w:sz w:val="22"/>
-                <w:szCs w:val="22"/>
-              </w:rPr>
-              <w:t>time.h</w:t>
-            </w:r>
-          </w:p>
-        </w:tc>
-        <w:tc>
-          <w:tcPr>
-            <w:tcW w:w="1275" w:type="dxa"/>
-            <w:tcMar>
-              <w:top w:w="100" w:type="nil"/>
-              <w:left w:w="20" w:type="nil"/>
-              <w:bottom w:w="20" w:type="nil"/>
-              <w:right w:w="100" w:type="nil"/>
-            </w:tcMar>
-            <w:vAlign w:val="center"/>
-          </w:tcPr>
-          <w:p>
-            <w:pPr>
-              <w:tabs>
-                <w:tab w:val="left" w:pos="560"/>
-                <w:tab w:val="left" w:pos="1120"/>
-                <w:tab w:val="left" w:pos="1680"/>
-                <w:tab w:val="left" w:pos="2240"/>
-                <w:tab w:val="left" w:pos="2800"/>
-                <w:tab w:val="left" w:pos="3360"/>
-                <w:tab w:val="left" w:pos="3920"/>
-                <w:tab w:val="left" w:pos="4480"/>
-                <w:tab w:val="left" w:pos="5040"/>
-                <w:tab w:val="left" w:pos="5600"/>
-                <w:tab w:val="left" w:pos="6160"/>
-                <w:tab w:val="left" w:pos="6720"/>
-              </w:tabs>
-              <w:autoSpaceDE w:val="0"/>
-              <w:autoSpaceDN w:val="0"/>
-              <w:adjustRightInd w:val="0"/>
-              <w:rPr>
-                <w:rFonts w:asciiTheme="minorHAnsi" w:hAnsiTheme="minorHAnsi" w:cstheme="minorHAnsi"/>
-                <w:sz w:val="22"/>
-                <w:szCs w:val="22"/>
-              </w:rPr>
-            </w:pPr>
-          </w:p>
-        </w:tc>
-        <w:tc>
-          <w:tcPr>
-            <w:tcW w:w="4962" w:type="dxa"/>
-            <w:tcMar>
-              <w:top w:w="100" w:type="nil"/>
-              <w:left w:w="20" w:type="nil"/>
-              <w:bottom w:w="20" w:type="nil"/>
-              <w:right w:w="100" w:type="nil"/>
-            </w:tcMar>
-            <w:vAlign w:val="center"/>
-          </w:tcPr>
-          <w:p>
-            <w:pPr>
-              <w:autoSpaceDE w:val="0"/>
-              <w:autoSpaceDN w:val="0"/>
-              <w:adjustRightInd w:val="0"/>
-              <w:rPr>
-                <w:rFonts w:asciiTheme="minorHAnsi" w:hAnsiTheme="minorHAnsi" w:cstheme="minorHAnsi"/>
-                <w:sz w:val="22"/>
-                <w:szCs w:val="22"/>
-              </w:rPr>
-            </w:pPr>
-            <w:r>
-              <w:rPr>
-                <w:rFonts w:asciiTheme="minorHAnsi" w:hAnsiTheme="minorHAnsi" w:cstheme="minorHAnsi"/>
-                <w:sz w:val="22"/>
-                <w:szCs w:val="22"/>
-              </w:rPr>
-              <w:t>gets NTP Server date and time; deciphers UNIX timestamp for the SECRET expiration date</w:t>
             </w:r>
           </w:p>
         </w:tc>
@@ -43540,6 +43399,15 @@
 </file>
 
 <file path=customXml/item1.xml><?xml version="1.0" encoding="utf-8"?>
+<?mso-contentType ?>
+<FormTemplates xmlns="http://schemas.microsoft.com/sharepoint/v3/contenttype/forms">
+  <Display>DocumentLibraryForm</Display>
+  <Edit>AssetEditForm</Edit>
+  <New>DocumentLibraryForm</New>
+</FormTemplates>
+</file>
+
+<file path=customXml/item2.xml><?xml version="1.0" encoding="utf-8"?>
 <p:properties xmlns:p="http://schemas.microsoft.com/office/2006/metadata/properties" xmlns:xsi="http://www.w3.org/2001/XMLSchema-instance" xmlns:pc="http://schemas.microsoft.com/office/infopath/2007/PartnerControls">
   <documentManagement>
     <TPExecutable xmlns="4eb71313-1cf6-4961-b6ce-0c29fc5284b9" xsi:nil="true"/>
@@ -43666,16 +43534,11 @@
 </p:properties>
 </file>
 
-<file path=customXml/item2.xml><?xml version="1.0" encoding="utf-8"?>
-<?mso-contentType ?>
-<FormTemplates xmlns="http://schemas.microsoft.com/sharepoint/v3/contenttype/forms">
-  <Display>DocumentLibraryForm</Display>
-  <Edit>AssetEditForm</Edit>
-  <New>DocumentLibraryForm</New>
-</FormTemplates>
+<file path=customXml/item3.xml><?xml version="1.0" encoding="utf-8"?>
+<b:Sources xmlns:b="http://schemas.openxmlformats.org/officeDocument/2006/bibliography" xmlns="http://schemas.openxmlformats.org/officeDocument/2006/bibliography" SelectedStyle="/APASixthEditionOfficeOnline.xsl" StyleName="APA" Version="6"/>
 </file>
 
-<file path=customXml/item3.xml><?xml version="1.0" encoding="utf-8"?>
+<file path=customXml/item4.xml><?xml version="1.0" encoding="utf-8"?>
 <ct:contentTypeSchema xmlns:ct="http://schemas.microsoft.com/office/2006/metadata/contentType" xmlns:ma="http://schemas.microsoft.com/office/2006/metadata/properties/metaAttributes" ct:_="" ma:_="" ma:contentTypeName="TemplateFile" ma:contentTypeID="0x010100AC6DD24B17643A43B5911557F59D23340400899CD97D2199F748BA22A48D93649A64" ma:contentTypeVersion="58" ma:contentTypeDescription="Create a new document." ma:contentTypeScope="" ma:versionID="cb85242d804791fa63a999220e43a0bf">
   <xsd:schema xmlns:xsd="http://www.w3.org/2001/XMLSchema" xmlns:xs="http://www.w3.org/2001/XMLSchema" xmlns:p="http://schemas.microsoft.com/office/2006/metadata/properties" xmlns:ns2="4eb71313-1cf6-4961-b6ce-0c29fc5284b9" targetNamespace="http://schemas.microsoft.com/office/2006/metadata/properties" ma:root="true" ma:fieldsID="2e13631c6b34a2889e7ce7c8f1efd12b" ns2:_="">
     <xsd:import namespace="4eb71313-1cf6-4961-b6ce-0c29fc5284b9"/>
@@ -44709,11 +44572,15 @@
 </ct:contentTypeSchema>
 </file>
 
-<file path=customXml/item4.xml><?xml version="1.0" encoding="utf-8"?>
-<b:Sources xmlns:b="http://schemas.openxmlformats.org/officeDocument/2006/bibliography" xmlns="http://schemas.openxmlformats.org/officeDocument/2006/bibliography" SelectedStyle="/APASixthEditionOfficeOnline.xsl" StyleName="APA" Version="6"/>
+<file path=customXml/itemProps1.xml><?xml version="1.0" encoding="utf-8"?>
+<ds:datastoreItem xmlns:ds="http://schemas.openxmlformats.org/officeDocument/2006/customXml" ds:itemID="{42AF3EE1-17D6-4994-8D19-1C5A21673D61}">
+  <ds:schemaRefs>
+    <ds:schemaRef ds:uri="http://schemas.microsoft.com/sharepoint/v3/contenttype/forms"/>
+  </ds:schemaRefs>
+</ds:datastoreItem>
 </file>
 
-<file path=customXml/itemProps1.xml><?xml version="1.0" encoding="utf-8"?>
+<file path=customXml/itemProps2.xml><?xml version="1.0" encoding="utf-8"?>
 <ds:datastoreItem xmlns:ds="http://schemas.openxmlformats.org/officeDocument/2006/customXml" ds:itemID="{63E3A13E-B3BC-4A1C-88E3-0C4AF2AB6AEE}">
   <ds:schemaRefs>
     <ds:schemaRef ds:uri="http://schemas.microsoft.com/office/2006/metadata/properties"/>
@@ -44723,15 +44590,15 @@
 </ds:datastoreItem>
 </file>
 
-<file path=customXml/itemProps2.xml><?xml version="1.0" encoding="utf-8"?>
-<ds:datastoreItem xmlns:ds="http://schemas.openxmlformats.org/officeDocument/2006/customXml" ds:itemID="{42AF3EE1-17D6-4994-8D19-1C5A21673D61}">
+<file path=customXml/itemProps3.xml><?xml version="1.0" encoding="utf-8"?>
+<ds:datastoreItem xmlns:ds="http://schemas.openxmlformats.org/officeDocument/2006/customXml" ds:itemID="{A9C8C408-4E5E-524B-A672-45D328F6189D}">
   <ds:schemaRefs>
-    <ds:schemaRef ds:uri="http://schemas.microsoft.com/sharepoint/v3/contenttype/forms"/>
+    <ds:schemaRef ds:uri="http://schemas.openxmlformats.org/officeDocument/2006/bibliography"/>
   </ds:schemaRefs>
 </ds:datastoreItem>
 </file>
 
-<file path=customXml/itemProps3.xml><?xml version="1.0" encoding="utf-8"?>
+<file path=customXml/itemProps4.xml><?xml version="1.0" encoding="utf-8"?>
 <ds:datastoreItem xmlns:ds="http://schemas.openxmlformats.org/officeDocument/2006/customXml" ds:itemID="{3D5BC34A-A158-4DE6-9D48-EADCE6F2EC60}">
   <ds:schemaRefs>
     <ds:schemaRef ds:uri="http://schemas.microsoft.com/office/2006/metadata/contentType"/>
@@ -44747,12 +44614,4 @@
     <ds:schemaRef ds:uri="http://schemas.microsoft.com/internal/obd"/>
   </ds:schemaRefs>
 </ds:datastoreItem>
-</file>
-
-<file path=customXml/itemProps4.xml><?xml version="1.0" encoding="utf-8"?>
-<ds:datastoreItem xmlns:ds="http://schemas.openxmlformats.org/officeDocument/2006/customXml" ds:itemID="{A9C8C408-4E5E-524B-A672-45D328F6189D}">
-  <ds:schemaRefs>
-    <ds:schemaRef ds:uri="http://schemas.openxmlformats.org/officeDocument/2006/bibliography"/>
-  </ds:schemaRefs>
-</ds:datastoreItem>
 </file>
</xml_diff>